<commit_message>
docs(srs): allow the AI-generated plan 15 seconds (PERF-7)
Updates the generation use case, its timeout alternative flow and PERF-7.
</commit_message>
<xml_diff>
--- a/docs/SRS_2006_Team2.docx
+++ b/docs/SRS_2006_Team2.docx
@@ -6859,7 +6859,7 @@
         <w:t xml:space="preserve"> The system completes backend AI module execution and displays the AI-Generated Plan within </w:t>
       </w:r>
       <w:r>
-        <w:t>10</w:t>
+        <w:t>15</w:t>
       </w:r>
       <w:r>
         <w:t xml:space="preserve"> seconds.</w:t>
@@ -6998,7 +6998,7 @@
         <w:t xml:space="preserve">exceeds the </w:t>
       </w:r>
       <w:r>
-        <w:t>10</w:t>
+        <w:t>15</w:t>
       </w:r>
       <w:r>
         <w:t xml:space="preserve"> second</w:t>
@@ -11103,7 +11103,7 @@
               <w:t xml:space="preserve">The system shall complete processing and display the AI-Generated Plan within </w:t>
             </w:r>
             <w:r>
-              <w:t>10</w:t>
+              <w:t>15</w:t>
             </w:r>
             <w:r>
               <w:t xml:space="preserve"> seconds after the user initiates generation.</w:t>

</xml_diff>

<commit_message>
docs(SRS): update completed SRS
</commit_message>
<xml_diff>
--- a/docs/SRS_2006_Team2.docx
+++ b/docs/SRS_2006_Team2.docx
@@ -82,7 +82,7 @@
         <w:spacing w:line="276" w:lineRule="auto"/>
       </w:pPr>
       <w:r>
-        <w:t>&lt;date created&gt;</w:t>
+        <w:t>25.10.2026</w:t>
       </w:r>
     </w:p>
     <w:p>
@@ -111,7 +111,7 @@
       <w:bookmarkStart w:id="2" w:name="_Toc346508722"/>
       <w:bookmarkStart w:id="3" w:name="_Toc346508952"/>
       <w:bookmarkStart w:id="4" w:name="_Toc346509227"/>
-      <w:bookmarkStart w:id="5" w:name="_Toc243827615"/>
+      <w:bookmarkStart w:id="5" w:name="_Toc243844384"/>
       <w:bookmarkEnd w:id="0"/>
       <w:bookmarkEnd w:id="1"/>
       <w:bookmarkEnd w:id="2"/>
@@ -165,7 +165,7 @@
         <w:fldChar w:fldCharType="begin"/>
       </w:r>
       <w:r>
-        <w:instrText xml:space="preserve"> PAGEREF _Toc243827615 \h </w:instrText>
+        <w:instrText xml:space="preserve"> PAGEREF _Toc243844384 \h </w:instrText>
       </w:r>
       <w:r>
         <w:fldChar w:fldCharType="separate"/>
@@ -198,7 +198,7 @@
         <w:fldChar w:fldCharType="begin"/>
       </w:r>
       <w:r>
-        <w:instrText xml:space="preserve"> PAGEREF _Toc243827616 \h </w:instrText>
+        <w:instrText xml:space="preserve"> PAGEREF _Toc243844385 \h </w:instrText>
       </w:r>
       <w:r>
         <w:fldChar w:fldCharType="separate"/>
@@ -244,7 +244,7 @@
         <w:fldChar w:fldCharType="begin"/>
       </w:r>
       <w:r>
-        <w:instrText xml:space="preserve"> PAGEREF _Toc243827617 \h </w:instrText>
+        <w:instrText xml:space="preserve"> PAGEREF _Toc243844386 \h </w:instrText>
       </w:r>
       <w:r>
         <w:fldChar w:fldCharType="separate"/>
@@ -310,7 +310,7 @@
         <w:rPr>
           <w:noProof/>
         </w:rPr>
-        <w:instrText xml:space="preserve"> PAGEREF _Toc243827618 \h </w:instrText>
+        <w:instrText xml:space="preserve"> PAGEREF _Toc243844387 \h </w:instrText>
       </w:r>
       <w:r>
         <w:rPr>
@@ -390,7 +390,7 @@
         <w:rPr>
           <w:noProof/>
         </w:rPr>
-        <w:instrText xml:space="preserve"> PAGEREF _Toc243827619 \h </w:instrText>
+        <w:instrText xml:space="preserve"> PAGEREF _Toc243844388 \h </w:instrText>
       </w:r>
       <w:r>
         <w:rPr>
@@ -470,7 +470,7 @@
         <w:rPr>
           <w:noProof/>
         </w:rPr>
-        <w:instrText xml:space="preserve"> PAGEREF _Toc243827620 \h </w:instrText>
+        <w:instrText xml:space="preserve"> PAGEREF _Toc243844389 \h </w:instrText>
       </w:r>
       <w:r>
         <w:rPr>
@@ -550,7 +550,7 @@
         <w:rPr>
           <w:noProof/>
         </w:rPr>
-        <w:instrText xml:space="preserve"> PAGEREF _Toc243827621 \h </w:instrText>
+        <w:instrText xml:space="preserve"> PAGEREF _Toc243844390 \h </w:instrText>
       </w:r>
       <w:r>
         <w:rPr>
@@ -630,7 +630,7 @@
         <w:rPr>
           <w:noProof/>
         </w:rPr>
-        <w:instrText xml:space="preserve"> PAGEREF _Toc243827622 \h </w:instrText>
+        <w:instrText xml:space="preserve"> PAGEREF _Toc243844391 \h </w:instrText>
       </w:r>
       <w:r>
         <w:rPr>
@@ -690,7 +690,7 @@
         <w:fldChar w:fldCharType="begin"/>
       </w:r>
       <w:r>
-        <w:instrText xml:space="preserve"> PAGEREF _Toc243827623 \h </w:instrText>
+        <w:instrText xml:space="preserve"> PAGEREF _Toc243844392 \h </w:instrText>
       </w:r>
       <w:r>
         <w:fldChar w:fldCharType="separate"/>
@@ -756,7 +756,7 @@
         <w:rPr>
           <w:noProof/>
         </w:rPr>
-        <w:instrText xml:space="preserve"> PAGEREF _Toc243827624 \h </w:instrText>
+        <w:instrText xml:space="preserve"> PAGEREF _Toc243844393 \h </w:instrText>
       </w:r>
       <w:r>
         <w:rPr>
@@ -836,7 +836,7 @@
         <w:rPr>
           <w:noProof/>
         </w:rPr>
-        <w:instrText xml:space="preserve"> PAGEREF _Toc243827625 \h </w:instrText>
+        <w:instrText xml:space="preserve"> PAGEREF _Toc243844394 \h </w:instrText>
       </w:r>
       <w:r>
         <w:rPr>
@@ -916,7 +916,7 @@
         <w:rPr>
           <w:noProof/>
         </w:rPr>
-        <w:instrText xml:space="preserve"> PAGEREF _Toc243827626 \h </w:instrText>
+        <w:instrText xml:space="preserve"> PAGEREF _Toc243844395 \h </w:instrText>
       </w:r>
       <w:r>
         <w:rPr>
@@ -996,7 +996,7 @@
         <w:rPr>
           <w:noProof/>
         </w:rPr>
-        <w:instrText xml:space="preserve"> PAGEREF _Toc243827627 \h </w:instrText>
+        <w:instrText xml:space="preserve"> PAGEREF _Toc243844396 \h </w:instrText>
       </w:r>
       <w:r>
         <w:rPr>
@@ -1076,7 +1076,7 @@
         <w:rPr>
           <w:noProof/>
         </w:rPr>
-        <w:instrText xml:space="preserve"> PAGEREF _Toc243827628 \h </w:instrText>
+        <w:instrText xml:space="preserve"> PAGEREF _Toc243844397 \h </w:instrText>
       </w:r>
       <w:r>
         <w:rPr>
@@ -1156,7 +1156,7 @@
         <w:rPr>
           <w:noProof/>
         </w:rPr>
-        <w:instrText xml:space="preserve"> PAGEREF _Toc243827629 \h </w:instrText>
+        <w:instrText xml:space="preserve"> PAGEREF _Toc243844398 \h </w:instrText>
       </w:r>
       <w:r>
         <w:rPr>
@@ -1236,7 +1236,7 @@
         <w:rPr>
           <w:noProof/>
         </w:rPr>
-        <w:instrText xml:space="preserve"> PAGEREF _Toc243827630 \h </w:instrText>
+        <w:instrText xml:space="preserve"> PAGEREF _Toc243844399 \h </w:instrText>
       </w:r>
       <w:r>
         <w:rPr>
@@ -1296,7 +1296,7 @@
         <w:fldChar w:fldCharType="begin"/>
       </w:r>
       <w:r>
-        <w:instrText xml:space="preserve"> PAGEREF _Toc243827631 \h </w:instrText>
+        <w:instrText xml:space="preserve"> PAGEREF _Toc243844400 \h </w:instrText>
       </w:r>
       <w:r>
         <w:fldChar w:fldCharType="separate"/>
@@ -1362,7 +1362,7 @@
         <w:rPr>
           <w:noProof/>
         </w:rPr>
-        <w:instrText xml:space="preserve"> PAGEREF _Toc243827632 \h </w:instrText>
+        <w:instrText xml:space="preserve"> PAGEREF _Toc243844401 \h </w:instrText>
       </w:r>
       <w:r>
         <w:rPr>
@@ -1442,7 +1442,7 @@
         <w:rPr>
           <w:noProof/>
         </w:rPr>
-        <w:instrText xml:space="preserve"> PAGEREF _Toc243827633 \h </w:instrText>
+        <w:instrText xml:space="preserve"> PAGEREF _Toc243844402 \h </w:instrText>
       </w:r>
       <w:r>
         <w:rPr>
@@ -1522,7 +1522,7 @@
         <w:rPr>
           <w:noProof/>
         </w:rPr>
-        <w:instrText xml:space="preserve"> PAGEREF _Toc243827634 \h </w:instrText>
+        <w:instrText xml:space="preserve"> PAGEREF _Toc243844403 \h </w:instrText>
       </w:r>
       <w:r>
         <w:rPr>
@@ -1539,7 +1539,7 @@
         <w:rPr>
           <w:noProof/>
         </w:rPr>
-        <w:t>5</w:t>
+        <w:t>6</w:t>
       </w:r>
       <w:r>
         <w:rPr>
@@ -1602,7 +1602,7 @@
         <w:rPr>
           <w:noProof/>
         </w:rPr>
-        <w:instrText xml:space="preserve"> PAGEREF _Toc243827635 \h </w:instrText>
+        <w:instrText xml:space="preserve"> PAGEREF _Toc243844404 \h </w:instrText>
       </w:r>
       <w:r>
         <w:rPr>
@@ -1619,7 +1619,7 @@
         <w:rPr>
           <w:noProof/>
         </w:rPr>
-        <w:t>5</w:t>
+        <w:t>6</w:t>
       </w:r>
       <w:r>
         <w:rPr>
@@ -1662,13 +1662,13 @@
         <w:fldChar w:fldCharType="begin"/>
       </w:r>
       <w:r>
-        <w:instrText xml:space="preserve"> PAGEREF _Toc243827636 \h </w:instrText>
+        <w:instrText xml:space="preserve"> PAGEREF _Toc243844405 \h </w:instrText>
       </w:r>
       <w:r>
         <w:fldChar w:fldCharType="separate"/>
       </w:r>
       <w:r>
-        <w:t>6</w:t>
+        <w:t>7</w:t>
       </w:r>
       <w:r>
         <w:fldChar w:fldCharType="end"/>
@@ -1728,7 +1728,7 @@
         <w:rPr>
           <w:noProof/>
         </w:rPr>
-        <w:instrText xml:space="preserve"> PAGEREF _Toc243827637 \h </w:instrText>
+        <w:instrText xml:space="preserve"> PAGEREF _Toc243844406 \h </w:instrText>
       </w:r>
       <w:r>
         <w:rPr>
@@ -1745,7 +1745,7 @@
         <w:rPr>
           <w:noProof/>
         </w:rPr>
-        <w:t>6</w:t>
+        <w:t>7</w:t>
       </w:r>
       <w:r>
         <w:rPr>
@@ -1808,7 +1808,7 @@
         <w:rPr>
           <w:noProof/>
         </w:rPr>
-        <w:instrText xml:space="preserve"> PAGEREF _Toc243827638 \h </w:instrText>
+        <w:instrText xml:space="preserve"> PAGEREF _Toc243844407 \h </w:instrText>
       </w:r>
       <w:r>
         <w:rPr>
@@ -1825,7 +1825,7 @@
         <w:rPr>
           <w:noProof/>
         </w:rPr>
-        <w:t>10</w:t>
+        <w:t>11</w:t>
       </w:r>
       <w:r>
         <w:rPr>
@@ -1888,7 +1888,7 @@
         <w:rPr>
           <w:noProof/>
         </w:rPr>
-        <w:instrText xml:space="preserve"> PAGEREF _Toc243827639 \h </w:instrText>
+        <w:instrText xml:space="preserve"> PAGEREF _Toc243844408 \h </w:instrText>
       </w:r>
       <w:r>
         <w:rPr>
@@ -1905,7 +1905,7 @@
         <w:rPr>
           <w:noProof/>
         </w:rPr>
-        <w:t>15</w:t>
+        <w:t>16</w:t>
       </w:r>
       <w:r>
         <w:rPr>
@@ -1968,7 +1968,7 @@
         <w:rPr>
           <w:noProof/>
         </w:rPr>
-        <w:instrText xml:space="preserve"> PAGEREF _Toc243827640 \h </w:instrText>
+        <w:instrText xml:space="preserve"> PAGEREF _Toc243844409 \h </w:instrText>
       </w:r>
       <w:r>
         <w:rPr>
@@ -1985,7 +1985,7 @@
         <w:rPr>
           <w:noProof/>
         </w:rPr>
-        <w:t>20</w:t>
+        <w:t>21</w:t>
       </w:r>
       <w:r>
         <w:rPr>
@@ -2048,7 +2048,7 @@
         <w:rPr>
           <w:noProof/>
         </w:rPr>
-        <w:instrText xml:space="preserve"> PAGEREF _Toc243827641 \h </w:instrText>
+        <w:instrText xml:space="preserve"> PAGEREF _Toc243844410 \h </w:instrText>
       </w:r>
       <w:r>
         <w:rPr>
@@ -2065,7 +2065,87 @@
         <w:rPr>
           <w:noProof/>
         </w:rPr>
-        <w:t>23</w:t>
+        <w:t>25</w:t>
+      </w:r>
+      <w:r>
+        <w:rPr>
+          <w:noProof/>
+        </w:rPr>
+        <w:fldChar w:fldCharType="end"/>
+      </w:r>
+    </w:p>
+    <w:p>
+      <w:pPr>
+        <w:pStyle w:val="TOC2"/>
+        <w:tabs>
+          <w:tab w:val="left" w:pos="960"/>
+        </w:tabs>
+        <w:rPr>
+          <w:rFonts w:ascii="Aptos" w:hAnsi="Aptos"/>
+          <w:noProof/>
+          <w:kern w:val="2"/>
+          <w:sz w:val="24"/>
+          <w:szCs w:val="24"/>
+          <w:lang w:eastAsia="en-US"/>
+        </w:rPr>
+      </w:pPr>
+      <w:r>
+        <w:rPr>
+          <w:noProof/>
+        </w:rPr>
+        <w:t>4.6</w:t>
+      </w:r>
+      <w:r>
+        <w:rPr>
+          <w:rFonts w:ascii="Aptos" w:hAnsi="Aptos"/>
+          <w:noProof/>
+          <w:kern w:val="2"/>
+          <w:sz w:val="24"/>
+          <w:szCs w:val="24"/>
+          <w:lang w:eastAsia="en-US"/>
+        </w:rPr>
+        <w:tab/>
+      </w:r>
+      <w:r>
+        <w:rPr>
+          <w:noProof/>
+        </w:rPr>
+        <w:t>Admin School Database Export</w:t>
+      </w:r>
+      <w:r>
+        <w:rPr>
+          <w:noProof/>
+        </w:rPr>
+        <w:tab/>
+      </w:r>
+      <w:r>
+        <w:rPr>
+          <w:noProof/>
+        </w:rPr>
+        <w:fldChar w:fldCharType="begin"/>
+      </w:r>
+      <w:r>
+        <w:rPr>
+          <w:noProof/>
+        </w:rPr>
+        <w:instrText xml:space="preserve"> PAGEREF _Toc243844411 \h </w:instrText>
+      </w:r>
+      <w:r>
+        <w:rPr>
+          <w:noProof/>
+        </w:rPr>
+      </w:r>
+      <w:r>
+        <w:rPr>
+          <w:noProof/>
+        </w:rPr>
+        <w:fldChar w:fldCharType="separate"/>
+      </w:r>
+      <w:r>
+        <w:rPr>
+          <w:noProof/>
+        </w:rPr>
+        <w:t>29</w:t>
       </w:r>
       <w:r>
         <w:rPr>
@@ -2108,13 +2188,13 @@
         <w:fldChar w:fldCharType="begin"/>
       </w:r>
       <w:r>
-        <w:instrText xml:space="preserve"> PAGEREF _Toc243827642 \h </w:instrText>
+        <w:instrText xml:space="preserve"> PAGEREF _Toc243844412 \h </w:instrText>
       </w:r>
       <w:r>
         <w:fldChar w:fldCharType="separate"/>
       </w:r>
       <w:r>
-        <w:t>27</w:t>
+        <w:t>30</w:t>
       </w:r>
       <w:r>
         <w:fldChar w:fldCharType="end"/>
@@ -2174,7 +2254,7 @@
         <w:rPr>
           <w:noProof/>
         </w:rPr>
-        <w:instrText xml:space="preserve"> PAGEREF _Toc243827643 \h </w:instrText>
+        <w:instrText xml:space="preserve"> PAGEREF _Toc243844413 \h </w:instrText>
       </w:r>
       <w:r>
         <w:rPr>
@@ -2191,7 +2271,7 @@
         <w:rPr>
           <w:noProof/>
         </w:rPr>
-        <w:t>27</w:t>
+        <w:t>30</w:t>
       </w:r>
       <w:r>
         <w:rPr>
@@ -2254,7 +2334,7 @@
         <w:rPr>
           <w:noProof/>
         </w:rPr>
-        <w:instrText xml:space="preserve"> PAGEREF _Toc243827644 \h </w:instrText>
+        <w:instrText xml:space="preserve"> PAGEREF _Toc243844414 \h </w:instrText>
       </w:r>
       <w:r>
         <w:rPr>
@@ -2271,7 +2351,7 @@
         <w:rPr>
           <w:noProof/>
         </w:rPr>
-        <w:t>28</w:t>
+        <w:t>31</w:t>
       </w:r>
       <w:r>
         <w:rPr>
@@ -2334,7 +2414,7 @@
         <w:rPr>
           <w:noProof/>
         </w:rPr>
-        <w:instrText xml:space="preserve"> PAGEREF _Toc243827645 \h </w:instrText>
+        <w:instrText xml:space="preserve"> PAGEREF _Toc243844415 \h </w:instrText>
       </w:r>
       <w:r>
         <w:rPr>
@@ -2351,7 +2431,7 @@
         <w:rPr>
           <w:noProof/>
         </w:rPr>
-        <w:t>28</w:t>
+        <w:t>31</w:t>
       </w:r>
       <w:r>
         <w:rPr>
@@ -2414,7 +2494,7 @@
         <w:rPr>
           <w:noProof/>
         </w:rPr>
-        <w:instrText xml:space="preserve"> PAGEREF _Toc243827646 \h </w:instrText>
+        <w:instrText xml:space="preserve"> PAGEREF _Toc243844416 \h </w:instrText>
       </w:r>
       <w:r>
         <w:rPr>
@@ -2431,7 +2511,7 @@
         <w:rPr>
           <w:noProof/>
         </w:rPr>
-        <w:t>29</w:t>
+        <w:t>32</w:t>
       </w:r>
       <w:r>
         <w:rPr>
@@ -2494,7 +2574,7 @@
         <w:rPr>
           <w:noProof/>
         </w:rPr>
-        <w:instrText xml:space="preserve"> PAGEREF _Toc243827647 \h </w:instrText>
+        <w:instrText xml:space="preserve"> PAGEREF _Toc243844417 \h </w:instrText>
       </w:r>
       <w:r>
         <w:rPr>
@@ -2511,7 +2591,7 @@
         <w:rPr>
           <w:noProof/>
         </w:rPr>
-        <w:t>30</w:t>
+        <w:t>33</w:t>
       </w:r>
       <w:r>
         <w:rPr>
@@ -2554,13 +2634,13 @@
         <w:fldChar w:fldCharType="begin"/>
       </w:r>
       <w:r>
-        <w:instrText xml:space="preserve"> PAGEREF _Toc243827648 \h </w:instrText>
+        <w:instrText xml:space="preserve"> PAGEREF _Toc243844418 \h </w:instrText>
       </w:r>
       <w:r>
         <w:fldChar w:fldCharType="separate"/>
       </w:r>
       <w:r>
-        <w:t>30</w:t>
+        <w:t>35</w:t>
       </w:r>
       <w:r>
         <w:fldChar w:fldCharType="end"/>
@@ -2578,7 +2658,7 @@
         </w:rPr>
       </w:pPr>
       <w:r>
-        <w:t>Appendix A: Glossary</w:t>
+        <w:t>Appendix A: Data Dictionary</w:t>
       </w:r>
       <w:r>
         <w:tab/>
@@ -2587,13 +2667,13 @@
         <w:fldChar w:fldCharType="begin"/>
       </w:r>
       <w:r>
-        <w:instrText xml:space="preserve"> PAGEREF _Toc243827649 \h </w:instrText>
+        <w:instrText xml:space="preserve"> PAGEREF _Toc243844419 \h </w:instrText>
       </w:r>
       <w:r>
         <w:fldChar w:fldCharType="separate"/>
       </w:r>
       <w:r>
-        <w:t>31</w:t>
+        <w:t>35</w:t>
       </w:r>
       <w:r>
         <w:fldChar w:fldCharType="end"/>
@@ -2620,13 +2700,13 @@
         <w:fldChar w:fldCharType="begin"/>
       </w:r>
       <w:r>
-        <w:instrText xml:space="preserve"> PAGEREF _Toc243827650 \h </w:instrText>
+        <w:instrText xml:space="preserve"> PAGEREF _Toc243844420 \h </w:instrText>
       </w:r>
       <w:r>
         <w:fldChar w:fldCharType="separate"/>
       </w:r>
       <w:r>
-        <w:t>31</w:t>
+        <w:t>35</w:t>
       </w:r>
       <w:r>
         <w:fldChar w:fldCharType="end"/>
@@ -2644,7 +2724,7 @@
         </w:rPr>
       </w:pPr>
       <w:r>
-        <w:t>Appendix C: To Be Determined List</w:t>
+        <w:t>Appendix C: UI Screenshots</w:t>
       </w:r>
       <w:r>
         <w:tab/>
@@ -2653,13 +2733,13 @@
         <w:fldChar w:fldCharType="begin"/>
       </w:r>
       <w:r>
-        <w:instrText xml:space="preserve"> PAGEREF _Toc243827651 \h </w:instrText>
+        <w:instrText xml:space="preserve"> PAGEREF _Toc243844421 \h </w:instrText>
       </w:r>
       <w:r>
         <w:fldChar w:fldCharType="separate"/>
       </w:r>
       <w:r>
-        <w:t>31</w:t>
+        <w:t>37</w:t>
       </w:r>
       <w:r>
         <w:fldChar w:fldCharType="end"/>
@@ -2698,7 +2778,7 @@
         <w:pStyle w:val="TOCEntry"/>
         <w:spacing w:line="276" w:lineRule="auto"/>
       </w:pPr>
-      <w:bookmarkStart w:id="6" w:name="_Toc243827616"/>
+      <w:bookmarkStart w:id="6" w:name="_Toc243844385"/>
       <w:r>
         <w:t>Revision History</w:t>
       </w:r>
@@ -2941,7 +3021,7 @@
         <w:spacing w:line="276" w:lineRule="auto"/>
       </w:pPr>
       <w:bookmarkStart w:id="7" w:name="_Toc439994665"/>
-      <w:bookmarkStart w:id="8" w:name="_Toc243827617"/>
+      <w:bookmarkStart w:id="8" w:name="_Toc243844386"/>
       <w:r>
         <w:lastRenderedPageBreak/>
         <w:t>Introduction</w:t>
@@ -2955,7 +3035,7 @@
         <w:spacing w:line="276" w:lineRule="auto"/>
       </w:pPr>
       <w:bookmarkStart w:id="9" w:name="_Toc439994667"/>
-      <w:bookmarkStart w:id="10" w:name="_Toc243827618"/>
+      <w:bookmarkStart w:id="10" w:name="_Toc243844387"/>
       <w:r>
         <w:t>Purpose</w:t>
       </w:r>
@@ -2984,7 +3064,7 @@
         <w:spacing w:line="276" w:lineRule="auto"/>
       </w:pPr>
       <w:bookmarkStart w:id="11" w:name="_Toc439994668"/>
-      <w:bookmarkStart w:id="12" w:name="_Toc243827619"/>
+      <w:bookmarkStart w:id="12" w:name="_Toc243844388"/>
       <w:r>
         <w:t>Document Conventions</w:t>
       </w:r>
@@ -3002,7 +3082,7 @@
         <w:spacing w:line="276" w:lineRule="auto"/>
       </w:pPr>
       <w:bookmarkStart w:id="13" w:name="_Toc439994669"/>
-      <w:bookmarkStart w:id="14" w:name="_Toc243827620"/>
+      <w:bookmarkStart w:id="14" w:name="_Toc243844389"/>
       <w:r>
         <w:t>Intended Audience and Reading Suggestions</w:t>
       </w:r>
@@ -3058,7 +3138,7 @@
         <w:spacing w:line="276" w:lineRule="auto"/>
       </w:pPr>
       <w:bookmarkStart w:id="15" w:name="_Toc439994670"/>
-      <w:bookmarkStart w:id="16" w:name="_Toc243827621"/>
+      <w:bookmarkStart w:id="16" w:name="_Toc243844390"/>
       <w:r>
         <w:t>Product Scope</w:t>
       </w:r>
@@ -3086,7 +3166,15 @@
     <w:p/>
     <w:p>
       <w:r>
-        <w:t>The application allows users to get a general idea of schools, view offered subjects/courses, and check historical admission benchmarks. Beyond acting as a directory, the system aims to help students understand what they are working towards by generating personalized educational roadmaps. Based on a student's academic scores, location, and career/subject interests, the platform creates step-by-step pathways to help them achieve their future goals.</w:t>
+        <w:t>The application allows users to get a general idea of schools, view offered subjects/</w:t>
+      </w:r>
+      <w:proofErr w:type="gramStart"/>
+      <w:r>
+        <w:t>courses, and</w:t>
+      </w:r>
+      <w:proofErr w:type="gramEnd"/>
+      <w:r>
+        <w:t xml:space="preserve"> check historical admission benchmarks. Beyond acting as a directory, the system aims to help students understand what they are working towards by generating personalized educational roadmaps. Based on a student's academic scores, location, and career/subject interests, the platform creates step-by-step pathways to help them achieve their future goals.</w:t>
       </w:r>
     </w:p>
     <w:p>
@@ -3095,7 +3183,7 @@
         <w:spacing w:line="276" w:lineRule="auto"/>
       </w:pPr>
       <w:bookmarkStart w:id="17" w:name="_Toc439994672"/>
-      <w:bookmarkStart w:id="18" w:name="_Toc243827622"/>
+      <w:bookmarkStart w:id="18" w:name="_Toc243844391"/>
       <w:r>
         <w:t>References</w:t>
       </w:r>
@@ -3113,7 +3201,16 @@
         <w:t>Data Dictionary</w:t>
       </w:r>
       <w:r>
-        <w:t xml:space="preserve"> (add appendix here)</w:t>
+        <w:t xml:space="preserve"> (</w:t>
+      </w:r>
+      <w:r>
+        <w:t>Appendix</w:t>
+      </w:r>
+      <w:r>
+        <w:t xml:space="preserve"> A</w:t>
+      </w:r>
+      <w:r>
+        <w:t>)</w:t>
       </w:r>
     </w:p>
     <w:p>
@@ -3124,7 +3221,10 @@
         </w:numPr>
       </w:pPr>
       <w:r>
-        <w:t>Dialog Map</w:t>
+        <w:t xml:space="preserve">Class Diagram </w:t>
+      </w:r>
+      <w:r>
+        <w:t>(Appendix B. 1)</w:t>
       </w:r>
     </w:p>
     <w:p>
@@ -3135,7 +3235,16 @@
         </w:numPr>
       </w:pPr>
       <w:r>
-        <w:t>Use Case Diagram</w:t>
+        <w:t>Dialog Map</w:t>
+      </w:r>
+      <w:r>
+        <w:t xml:space="preserve"> (Appendix B. </w:t>
+      </w:r>
+      <w:r>
+        <w:t>2</w:t>
+      </w:r>
+      <w:r>
+        <w:t>)</w:t>
       </w:r>
     </w:p>
     <w:p>
@@ -3146,7 +3255,19 @@
         </w:numPr>
       </w:pPr>
       <w:r>
-        <w:t>Use Case Description</w:t>
+        <w:t>Use Case Diagram</w:t>
+      </w:r>
+      <w:r>
+        <w:t xml:space="preserve"> </w:t>
+      </w:r>
+      <w:r>
+        <w:t xml:space="preserve">(Appendix B. </w:t>
+      </w:r>
+      <w:r>
+        <w:t>3</w:t>
+      </w:r>
+      <w:r>
+        <w:t>)</w:t>
       </w:r>
     </w:p>
     <w:p>
@@ -3189,7 +3310,7 @@
         <w:spacing w:line="276" w:lineRule="auto"/>
       </w:pPr>
       <w:bookmarkStart w:id="19" w:name="_Toc439994673"/>
-      <w:bookmarkStart w:id="20" w:name="_Toc243827623"/>
+      <w:bookmarkStart w:id="20" w:name="_Toc243844392"/>
       <w:r>
         <w:lastRenderedPageBreak/>
         <w:t>Overall Description</w:t>
@@ -3203,7 +3324,7 @@
         <w:spacing w:line="276" w:lineRule="auto"/>
       </w:pPr>
       <w:bookmarkStart w:id="21" w:name="_Toc439994674"/>
-      <w:bookmarkStart w:id="22" w:name="_Toc243827624"/>
+      <w:bookmarkStart w:id="22" w:name="_Toc243844393"/>
       <w:r>
         <w:t>Product Perspective</w:t>
       </w:r>
@@ -3226,7 +3347,7 @@
         <w:spacing w:line="276" w:lineRule="auto"/>
       </w:pPr>
       <w:bookmarkStart w:id="23" w:name="_Toc439994675"/>
-      <w:bookmarkStart w:id="24" w:name="_Toc243827625"/>
+      <w:bookmarkStart w:id="24" w:name="_Toc243844394"/>
       <w:r>
         <w:t>Product Functions</w:t>
       </w:r>
@@ -3347,7 +3468,7 @@
         <w:spacing w:line="276" w:lineRule="auto"/>
       </w:pPr>
       <w:bookmarkStart w:id="25" w:name="_Toc439994676"/>
-      <w:bookmarkStart w:id="26" w:name="_Toc243827626"/>
+      <w:bookmarkStart w:id="26" w:name="_Toc243844395"/>
       <w:r>
         <w:t>User Classes and Characteristics</w:t>
       </w:r>
@@ -3398,7 +3519,7 @@
         <w:spacing w:line="276" w:lineRule="auto"/>
       </w:pPr>
       <w:bookmarkStart w:id="27" w:name="_Toc439994677"/>
-      <w:bookmarkStart w:id="28" w:name="_Toc243827627"/>
+      <w:bookmarkStart w:id="28" w:name="_Toc243844396"/>
       <w:r>
         <w:t>Operating Environment</w:t>
       </w:r>
@@ -3457,7 +3578,7 @@
         <w:spacing w:line="276" w:lineRule="auto"/>
       </w:pPr>
       <w:bookmarkStart w:id="29" w:name="_Toc439994678"/>
-      <w:bookmarkStart w:id="30" w:name="_Toc243827628"/>
+      <w:bookmarkStart w:id="30" w:name="_Toc243844397"/>
       <w:r>
         <w:t>Design and Implementation Constraints</w:t>
       </w:r>
@@ -3528,7 +3649,15 @@
         <w:t>Database Constraints:</w:t>
       </w:r>
       <w:r>
-        <w:t xml:space="preserve"> A local SQLite database is utilized, meaning database updates are handled via bulk transaction uploads by an administrator rather than automated live-syncing with external databases.</w:t>
+        <w:t xml:space="preserve"> A local SQLite database is utilized, meaning database updates are handled via bulk transaction uploads by an administrator rather than automated </w:t>
+      </w:r>
+      <w:proofErr w:type="gramStart"/>
+      <w:r>
+        <w:t>live-syncing</w:t>
+      </w:r>
+      <w:proofErr w:type="gramEnd"/>
+      <w:r>
+        <w:t xml:space="preserve"> with external databases.</w:t>
       </w:r>
     </w:p>
     <w:p>
@@ -3537,7 +3666,7 @@
         <w:spacing w:line="276" w:lineRule="auto"/>
       </w:pPr>
       <w:bookmarkStart w:id="31" w:name="_Toc439994679"/>
-      <w:bookmarkStart w:id="32" w:name="_Toc243827629"/>
+      <w:bookmarkStart w:id="32" w:name="_Toc243844398"/>
       <w:r>
         <w:t>User Documentation</w:t>
       </w:r>
@@ -3555,7 +3684,7 @@
         <w:spacing w:line="276" w:lineRule="auto"/>
       </w:pPr>
       <w:bookmarkStart w:id="33" w:name="_Toc439994680"/>
-      <w:bookmarkStart w:id="34" w:name="_Toc243827630"/>
+      <w:bookmarkStart w:id="34" w:name="_Toc243844399"/>
       <w:r>
         <w:t>Assumptions and Dependencies</w:t>
       </w:r>
@@ -3597,7 +3726,15 @@
         <w:t>School Data Source:</w:t>
       </w:r>
       <w:r>
-        <w:t xml:space="preserve"> The system depends on the availability of official school datasets from data.gov.sg. It assumes that the format and schema of the CSV files provided by this portal will remain relatively consistent so that the Admin upload and parsing functions continue to work correctly.</w:t>
+        <w:t xml:space="preserve"> The system depends on the availability of official school datasets from data.gov.sg. It assumes that the format and schema of the CSV files provided by this portal will remain relatively consistent so that the </w:t>
+      </w:r>
+      <w:proofErr w:type="gramStart"/>
+      <w:r>
+        <w:t>Admin</w:t>
+      </w:r>
+      <w:proofErr w:type="gramEnd"/>
+      <w:r>
+        <w:t xml:space="preserve"> upload and parsing functions continue to work correctly.</w:t>
       </w:r>
     </w:p>
     <w:p>
@@ -3606,7 +3743,7 @@
         <w:spacing w:line="276" w:lineRule="auto"/>
       </w:pPr>
       <w:bookmarkStart w:id="35" w:name="_Toc439994682"/>
-      <w:bookmarkStart w:id="36" w:name="_Toc243827631"/>
+      <w:bookmarkStart w:id="36" w:name="_Toc243844400"/>
       <w:r>
         <w:lastRenderedPageBreak/>
         <w:t>External Interface Requirements</w:t>
@@ -3619,19 +3756,215 @@
         <w:pStyle w:val="Heading2"/>
         <w:spacing w:line="276" w:lineRule="auto"/>
       </w:pPr>
-      <w:bookmarkStart w:id="37" w:name="_Toc243827632"/>
+      <w:bookmarkStart w:id="37" w:name="_Toc243844401"/>
       <w:r>
         <w:t>User Interfaces</w:t>
       </w:r>
       <w:bookmarkEnd w:id="37"/>
     </w:p>
     <w:p>
-      <w:pPr>
-        <w:pStyle w:val="template"/>
-        <w:spacing w:line="276" w:lineRule="auto"/>
-      </w:pPr>
-      <w:r>
-        <w:t>&lt;Describe the logical characteristics of each interface between the software product and the users. This may include sample screen images, any GUI standards or product family style guides that are to be followed, screen layout constraints, standard buttons and functions (e.g., help) that will appear on every screen, keyboard shortcuts, error message display standards, and so on. Define the software components for which a user interface is needed. Details of the user interface design should be documented in a separate user interface specification.&gt;</w:t>
+      <w:proofErr w:type="spellStart"/>
+      <w:r>
+        <w:t>PathSG</w:t>
+      </w:r>
+      <w:proofErr w:type="spellEnd"/>
+      <w:r>
+        <w:t xml:space="preserve"> is used through a web browser. Every page shares the same layout and the same standard components.</w:t>
+      </w:r>
+    </w:p>
+    <w:p/>
+    <w:p>
+      <w:r>
+        <w:t>Common layout and standards</w:t>
+      </w:r>
+    </w:p>
+    <w:p/>
+    <w:p>
+      <w:pPr>
+        <w:numPr>
+          <w:ilvl w:val="0"/>
+          <w:numId w:val="50"/>
+        </w:numPr>
+      </w:pPr>
+      <w:r>
+        <w:rPr>
+          <w:b/>
+          <w:bCs/>
+        </w:rPr>
+        <w:t>Header:</w:t>
+      </w:r>
+      <w:r>
+        <w:t xml:space="preserve"> shown on every page. It has the </w:t>
+      </w:r>
+      <w:proofErr w:type="spellStart"/>
+      <w:r>
+        <w:t>PathSG</w:t>
+      </w:r>
+      <w:proofErr w:type="spellEnd"/>
+      <w:r>
+        <w:t xml:space="preserve"> logo and the main menu: Directory, Roadmap, Saved, My Profile, Admin Panel, and Log in / Log out. Guests only see Directory, Roadmap and Log in. The Admin Panel link only appears </w:t>
+      </w:r>
+      <w:proofErr w:type="gramStart"/>
+      <w:r>
+        <w:t>for</w:t>
+      </w:r>
+      <w:proofErr w:type="gramEnd"/>
+      <w:r>
+        <w:t xml:space="preserve"> administrators. On phones, the menu collapses into a single menu button.</w:t>
+      </w:r>
+    </w:p>
+    <w:p/>
+    <w:p>
+      <w:pPr>
+        <w:numPr>
+          <w:ilvl w:val="0"/>
+          <w:numId w:val="50"/>
+        </w:numPr>
+      </w:pPr>
+      <w:r>
+        <w:rPr>
+          <w:b/>
+          <w:bCs/>
+        </w:rPr>
+        <w:t>Notice banner:</w:t>
+      </w:r>
+      <w:r>
+        <w:t xml:space="preserve"> a short message under the header (for example, “Roadmap saved to your profile.”). It disappears when the user moves to another page.</w:t>
+      </w:r>
+    </w:p>
+    <w:p/>
+    <w:p>
+      <w:pPr>
+        <w:numPr>
+          <w:ilvl w:val="0"/>
+          <w:numId w:val="50"/>
+        </w:numPr>
+      </w:pPr>
+      <w:r>
+        <w:rPr>
+          <w:b/>
+          <w:bCs/>
+        </w:rPr>
+        <w:t>Pop-up dialogs:</w:t>
+      </w:r>
+      <w:r>
+        <w:t xml:space="preserve"> used for confirmations (delete roadmap, overwrite roadmap, delete review) and for serious errors. They can be closed with a button or the Esc key.</w:t>
+      </w:r>
+    </w:p>
+    <w:p/>
+    <w:p>
+      <w:pPr>
+        <w:numPr>
+          <w:ilvl w:val="0"/>
+          <w:numId w:val="50"/>
+        </w:numPr>
+      </w:pPr>
+      <w:r>
+        <w:rPr>
+          <w:b/>
+          <w:bCs/>
+        </w:rPr>
+        <w:t>Error messages:</w:t>
+      </w:r>
+      <w:r>
+        <w:t xml:space="preserve"> shown in red, next to the field that has the problem. The wording follows the messages in Section 4.</w:t>
+      </w:r>
+    </w:p>
+    <w:p/>
+    <w:p>
+      <w:pPr>
+        <w:numPr>
+          <w:ilvl w:val="0"/>
+          <w:numId w:val="50"/>
+        </w:numPr>
+      </w:pPr>
+      <w:r>
+        <w:rPr>
+          <w:b/>
+          <w:bCs/>
+        </w:rPr>
+        <w:t>Loading states:</w:t>
+      </w:r>
+      <w:r>
+        <w:t xml:space="preserve"> a spinner is shown while data loads. The roadmap page shows the rule-based and AI plans separately, so a slow AI plan does not block the other.</w:t>
+      </w:r>
+    </w:p>
+    <w:p/>
+    <w:p>
+      <w:pPr>
+        <w:numPr>
+          <w:ilvl w:val="0"/>
+          <w:numId w:val="50"/>
+        </w:numPr>
+      </w:pPr>
+      <w:r>
+        <w:rPr>
+          <w:b/>
+          <w:bCs/>
+        </w:rPr>
+        <w:t>Responsive design:</w:t>
+      </w:r>
+      <w:r>
+        <w:t xml:space="preserve"> works from 375px (phones) to 1920px (desktop), with touch targets of at least 44px in the mobile menu.</w:t>
+      </w:r>
+    </w:p>
+    <w:p/>
+    <w:p>
+      <w:pPr>
+        <w:numPr>
+          <w:ilvl w:val="0"/>
+          <w:numId w:val="50"/>
+        </w:numPr>
+      </w:pPr>
+      <w:r>
+        <w:rPr>
+          <w:b/>
+          <w:bCs/>
+        </w:rPr>
+        <w:t>Keyboard and accessibility:</w:t>
+      </w:r>
+      <w:r>
+        <w:t xml:space="preserve"> all buttons and fields can be used with the keyboard and show a visible focus outline. Form fields have labels, and error messages are announced to screen readers.</w:t>
+      </w:r>
+    </w:p>
+    <w:p/>
+    <w:p>
+      <w:pPr>
+        <w:numPr>
+          <w:ilvl w:val="0"/>
+          <w:numId w:val="50"/>
+        </w:numPr>
+      </w:pPr>
+      <w:r>
+        <w:rPr>
+          <w:b/>
+          <w:bCs/>
+        </w:rPr>
+        <w:t>Style:</w:t>
+      </w:r>
+      <w:r>
+        <w:t xml:space="preserve"> one </w:t>
+      </w:r>
+      <w:proofErr w:type="spellStart"/>
+      <w:r>
+        <w:t>colour</w:t>
+      </w:r>
+      <w:proofErr w:type="spellEnd"/>
+      <w:r>
+        <w:t xml:space="preserve"> theme and one font (Public Sans) across all pages, built from shared components.</w:t>
+      </w:r>
+    </w:p>
+    <w:p>
+      <w:pPr>
+        <w:ind w:left="360"/>
+      </w:pPr>
+    </w:p>
+    <w:p>
+      <w:pPr>
+        <w:ind w:left="360"/>
+      </w:pPr>
+      <w:r>
+        <w:t>Relevant screenshots can be found in Appendix C</w:t>
       </w:r>
     </w:p>
     <w:p>
@@ -3640,7 +3973,7 @@
         <w:spacing w:line="276" w:lineRule="auto"/>
       </w:pPr>
       <w:bookmarkStart w:id="38" w:name="_Toc439994684"/>
-      <w:bookmarkStart w:id="39" w:name="_Toc243827633"/>
+      <w:bookmarkStart w:id="39" w:name="_Toc243844402"/>
       <w:r>
         <w:t>Hardware Interfaces</w:t>
       </w:r>
@@ -3648,12 +3981,53 @@
       <w:bookmarkEnd w:id="39"/>
     </w:p>
     <w:p>
-      <w:pPr>
-        <w:pStyle w:val="template"/>
-        <w:spacing w:line="276" w:lineRule="auto"/>
-      </w:pPr>
-      <w:r>
-        <w:t>&lt;Describe the logical and physical characteristics of each interface between the software product and the hardware components of the system. This may include the supported device types, the nature of the data and control interactions between the software and the hardware, and communication protocols to be used.&gt;</w:t>
+      <w:proofErr w:type="spellStart"/>
+      <w:r>
+        <w:t>PathSG</w:t>
+      </w:r>
+      <w:proofErr w:type="spellEnd"/>
+      <w:r>
+        <w:t xml:space="preserve"> has no direct connection to any special hardware. It does not use sensors, cameras, printers or other devices. All hardware access goes through the user’s web browser and operating system.</w:t>
+      </w:r>
+    </w:p>
+    <w:p/>
+    <w:p>
+      <w:r>
+        <w:rPr>
+          <w:b/>
+          <w:bCs/>
+        </w:rPr>
+        <w:t>User devices:</w:t>
+      </w:r>
+      <w:r>
+        <w:t xml:space="preserve"> any phone, tablet, laptop or desktop that can run a supported browser (Chrome, Firefox or Safari). Input is by keyboard, mouse or touch.</w:t>
+      </w:r>
+    </w:p>
+    <w:p/>
+    <w:p>
+      <w:r>
+        <w:rPr>
+          <w:b/>
+          <w:bCs/>
+        </w:rPr>
+        <w:t>File selection (administrators):</w:t>
+      </w:r>
+      <w:r>
+        <w:t xml:space="preserve"> the Admin Panel reads CSV files from the administrator’s computer, using the browser’s file picker or drag and drop.</w:t>
+      </w:r>
+    </w:p>
+    <w:p/>
+    <w:p>
+      <w:r>
+        <w:rPr>
+          <w:b/>
+          <w:bCs/>
+        </w:rPr>
+        <w:lastRenderedPageBreak/>
+        <w:t>Server:</w:t>
+      </w:r>
+      <w:r>
+        <w:t xml:space="preserve"> the system runs in Docker containers on a cloud host. It only needs normal server resources (CPU, memory, network, and disk for the SQLite database and uploaded CSV files). No special hardware is required.</w:t>
       </w:r>
     </w:p>
     <w:p>
@@ -3662,20 +4036,835 @@
         <w:spacing w:line="276" w:lineRule="auto"/>
       </w:pPr>
       <w:bookmarkStart w:id="40" w:name="_Toc439994685"/>
-      <w:bookmarkStart w:id="41" w:name="_Toc243827634"/>
+      <w:bookmarkStart w:id="41" w:name="_Toc243844403"/>
       <w:r>
         <w:t>Software Interfaces</w:t>
       </w:r>
       <w:bookmarkEnd w:id="40"/>
       <w:bookmarkEnd w:id="41"/>
     </w:p>
-    <w:p>
-      <w:pPr>
-        <w:pStyle w:val="template"/>
-        <w:spacing w:line="276" w:lineRule="auto"/>
-      </w:pPr>
-      <w:r>
-        <w:t>&lt;Describe the connections between this product and other specific software components (name and version), including databases, operating systems, tools, libraries, and integrated commercial components. Identify the data items or messages coming into the system and going out and describe the purpose of each. Describe the services needed and the nature of communications. Refer to documents that describe detailed application programming interface protocols. Identify data that will be shared across software components. If the data sharing mechanism must be implemented in a specific way (for example, use of a global data area in a multitasking operating system), specify this as an implementation constraint.&gt;</w:t>
+    <w:tbl>
+      <w:tblPr>
+        <w:tblW w:w="0" w:type="auto"/>
+        <w:tblBorders>
+          <w:top w:val="single" w:sz="4" w:space="0" w:color="auto"/>
+          <w:left w:val="single" w:sz="4" w:space="0" w:color="auto"/>
+          <w:bottom w:val="single" w:sz="4" w:space="0" w:color="auto"/>
+          <w:right w:val="single" w:sz="4" w:space="0" w:color="auto"/>
+          <w:insideH w:val="single" w:sz="4" w:space="0" w:color="auto"/>
+          <w:insideV w:val="single" w:sz="4" w:space="0" w:color="auto"/>
+        </w:tblBorders>
+        <w:tblLook w:val="04A0" w:firstRow="1" w:lastRow="0" w:firstColumn="1" w:lastColumn="0" w:noHBand="0" w:noVBand="1"/>
+      </w:tblPr>
+      <w:tblGrid>
+        <w:gridCol w:w="3288"/>
+        <w:gridCol w:w="3288"/>
+        <w:gridCol w:w="3288"/>
+      </w:tblGrid>
+      <w:tr>
+        <w:tc>
+          <w:tcPr>
+            <w:tcW w:w="3288" w:type="dxa"/>
+          </w:tcPr>
+          <w:p>
+            <w:pPr>
+              <w:rPr>
+                <w:rFonts w:eastAsia="Aptos"/>
+                <w:b/>
+                <w:bCs/>
+                <w:kern w:val="2"/>
+                <w:szCs w:val="24"/>
+              </w:rPr>
+            </w:pPr>
+            <w:r>
+              <w:rPr>
+                <w:rFonts w:eastAsia="Aptos"/>
+                <w:b/>
+                <w:bCs/>
+                <w:kern w:val="2"/>
+                <w:szCs w:val="24"/>
+              </w:rPr>
+              <w:t>Component</w:t>
+            </w:r>
+          </w:p>
+        </w:tc>
+        <w:tc>
+          <w:tcPr>
+            <w:tcW w:w="3288" w:type="dxa"/>
+          </w:tcPr>
+          <w:p>
+            <w:pPr>
+              <w:rPr>
+                <w:rFonts w:eastAsia="Aptos"/>
+                <w:b/>
+                <w:bCs/>
+                <w:kern w:val="2"/>
+                <w:szCs w:val="24"/>
+              </w:rPr>
+            </w:pPr>
+            <w:r>
+              <w:rPr>
+                <w:rFonts w:eastAsia="Aptos"/>
+                <w:b/>
+                <w:bCs/>
+                <w:kern w:val="2"/>
+                <w:szCs w:val="24"/>
+              </w:rPr>
+              <w:t>Detail</w:t>
+            </w:r>
+          </w:p>
+        </w:tc>
+        <w:tc>
+          <w:tcPr>
+            <w:tcW w:w="3288" w:type="dxa"/>
+          </w:tcPr>
+          <w:p>
+            <w:pPr>
+              <w:rPr>
+                <w:rFonts w:eastAsia="Aptos"/>
+                <w:b/>
+                <w:bCs/>
+                <w:kern w:val="2"/>
+                <w:szCs w:val="24"/>
+              </w:rPr>
+            </w:pPr>
+            <w:r>
+              <w:rPr>
+                <w:rFonts w:eastAsia="Aptos"/>
+                <w:b/>
+                <w:bCs/>
+                <w:kern w:val="2"/>
+                <w:szCs w:val="24"/>
+              </w:rPr>
+              <w:t>Purpose</w:t>
+            </w:r>
+          </w:p>
+        </w:tc>
+      </w:tr>
+      <w:tr>
+        <w:tc>
+          <w:tcPr>
+            <w:tcW w:w="3288" w:type="dxa"/>
+          </w:tcPr>
+          <w:p>
+            <w:pPr>
+              <w:rPr>
+                <w:rFonts w:eastAsia="Aptos"/>
+                <w:kern w:val="2"/>
+                <w:szCs w:val="24"/>
+              </w:rPr>
+            </w:pPr>
+            <w:r>
+              <w:rPr>
+                <w:rFonts w:eastAsia="Aptos"/>
+                <w:kern w:val="2"/>
+                <w:szCs w:val="24"/>
+              </w:rPr>
+              <w:t>Web browser</w:t>
+            </w:r>
+          </w:p>
+        </w:tc>
+        <w:tc>
+          <w:tcPr>
+            <w:tcW w:w="3288" w:type="dxa"/>
+          </w:tcPr>
+          <w:p>
+            <w:pPr>
+              <w:rPr>
+                <w:rFonts w:eastAsia="Aptos"/>
+                <w:kern w:val="2"/>
+                <w:szCs w:val="24"/>
+              </w:rPr>
+            </w:pPr>
+            <w:r>
+              <w:rPr>
+                <w:rFonts w:eastAsia="Aptos"/>
+                <w:kern w:val="2"/>
+                <w:szCs w:val="24"/>
+              </w:rPr>
+              <w:t>Latest Chrome, Firefox, Safari</w:t>
+            </w:r>
+          </w:p>
+        </w:tc>
+        <w:tc>
+          <w:tcPr>
+            <w:tcW w:w="3288" w:type="dxa"/>
+          </w:tcPr>
+          <w:p>
+            <w:pPr>
+              <w:rPr>
+                <w:rFonts w:eastAsia="Aptos"/>
+                <w:kern w:val="2"/>
+                <w:szCs w:val="24"/>
+              </w:rPr>
+            </w:pPr>
+            <w:r>
+              <w:rPr>
+                <w:rFonts w:eastAsia="Aptos"/>
+                <w:kern w:val="2"/>
+                <w:szCs w:val="24"/>
+              </w:rPr>
+              <w:t xml:space="preserve">Runs the </w:t>
+            </w:r>
+            <w:proofErr w:type="spellStart"/>
+            <w:r>
+              <w:rPr>
+                <w:rFonts w:eastAsia="Aptos"/>
+                <w:kern w:val="2"/>
+                <w:szCs w:val="24"/>
+              </w:rPr>
+              <w:t>PathSG</w:t>
+            </w:r>
+            <w:proofErr w:type="spellEnd"/>
+            <w:r>
+              <w:rPr>
+                <w:rFonts w:eastAsia="Aptos"/>
+                <w:kern w:val="2"/>
+                <w:szCs w:val="24"/>
+              </w:rPr>
+              <w:t xml:space="preserve"> frontend.</w:t>
+            </w:r>
+          </w:p>
+        </w:tc>
+      </w:tr>
+      <w:tr>
+        <w:tc>
+          <w:tcPr>
+            <w:tcW w:w="3288" w:type="dxa"/>
+          </w:tcPr>
+          <w:p>
+            <w:pPr>
+              <w:rPr>
+                <w:rFonts w:eastAsia="Aptos"/>
+                <w:kern w:val="2"/>
+                <w:szCs w:val="24"/>
+              </w:rPr>
+            </w:pPr>
+            <w:r>
+              <w:rPr>
+                <w:rFonts w:eastAsia="Aptos"/>
+                <w:kern w:val="2"/>
+                <w:szCs w:val="24"/>
+              </w:rPr>
+              <w:t>Frontend</w:t>
+            </w:r>
+          </w:p>
+        </w:tc>
+        <w:tc>
+          <w:tcPr>
+            <w:tcW w:w="3288" w:type="dxa"/>
+          </w:tcPr>
+          <w:p>
+            <w:pPr>
+              <w:rPr>
+                <w:rFonts w:eastAsia="Aptos"/>
+                <w:kern w:val="2"/>
+                <w:szCs w:val="24"/>
+              </w:rPr>
+            </w:pPr>
+            <w:r>
+              <w:rPr>
+                <w:rFonts w:eastAsia="Aptos"/>
+                <w:kern w:val="2"/>
+                <w:szCs w:val="24"/>
+              </w:rPr>
+              <w:t xml:space="preserve">Vue 3, TypeScript, Vite, </w:t>
+            </w:r>
+            <w:proofErr w:type="spellStart"/>
+            <w:r>
+              <w:rPr>
+                <w:rFonts w:eastAsia="Aptos"/>
+                <w:kern w:val="2"/>
+                <w:szCs w:val="24"/>
+              </w:rPr>
+              <w:t>Pinia</w:t>
+            </w:r>
+            <w:proofErr w:type="spellEnd"/>
+            <w:r>
+              <w:rPr>
+                <w:rFonts w:eastAsia="Aptos"/>
+                <w:kern w:val="2"/>
+                <w:szCs w:val="24"/>
+              </w:rPr>
+              <w:t>, Vue Router, Tailwind CSS</w:t>
+            </w:r>
+          </w:p>
+        </w:tc>
+        <w:tc>
+          <w:tcPr>
+            <w:tcW w:w="3288" w:type="dxa"/>
+          </w:tcPr>
+          <w:p>
+            <w:pPr>
+              <w:rPr>
+                <w:rFonts w:eastAsia="Aptos"/>
+                <w:kern w:val="2"/>
+                <w:szCs w:val="24"/>
+              </w:rPr>
+            </w:pPr>
+            <w:r>
+              <w:rPr>
+                <w:rFonts w:eastAsia="Aptos"/>
+                <w:kern w:val="2"/>
+                <w:szCs w:val="24"/>
+              </w:rPr>
+              <w:t>User interface, page navigation, state handling.</w:t>
+            </w:r>
+          </w:p>
+        </w:tc>
+      </w:tr>
+      <w:tr>
+        <w:tc>
+          <w:tcPr>
+            <w:tcW w:w="3288" w:type="dxa"/>
+          </w:tcPr>
+          <w:p>
+            <w:pPr>
+              <w:rPr>
+                <w:rFonts w:eastAsia="Aptos"/>
+                <w:kern w:val="2"/>
+                <w:szCs w:val="24"/>
+              </w:rPr>
+            </w:pPr>
+            <w:r>
+              <w:rPr>
+                <w:rFonts w:eastAsia="Aptos"/>
+                <w:kern w:val="2"/>
+                <w:szCs w:val="24"/>
+              </w:rPr>
+              <w:t>Backend</w:t>
+            </w:r>
+          </w:p>
+        </w:tc>
+        <w:tc>
+          <w:tcPr>
+            <w:tcW w:w="3288" w:type="dxa"/>
+          </w:tcPr>
+          <w:p>
+            <w:pPr>
+              <w:rPr>
+                <w:rFonts w:eastAsia="Aptos"/>
+                <w:kern w:val="2"/>
+                <w:szCs w:val="24"/>
+              </w:rPr>
+            </w:pPr>
+            <w:r>
+              <w:rPr>
+                <w:rFonts w:eastAsia="Aptos"/>
+                <w:kern w:val="2"/>
+                <w:szCs w:val="24"/>
+              </w:rPr>
+              <w:t xml:space="preserve">Python 3.14, </w:t>
+            </w:r>
+            <w:proofErr w:type="spellStart"/>
+            <w:r>
+              <w:rPr>
+                <w:rFonts w:eastAsia="Aptos"/>
+                <w:kern w:val="2"/>
+                <w:szCs w:val="24"/>
+              </w:rPr>
+              <w:t>FastAPI</w:t>
+            </w:r>
+            <w:proofErr w:type="spellEnd"/>
+            <w:r>
+              <w:rPr>
+                <w:rFonts w:eastAsia="Aptos"/>
+                <w:kern w:val="2"/>
+                <w:szCs w:val="24"/>
+              </w:rPr>
+              <w:t xml:space="preserve">, </w:t>
+            </w:r>
+            <w:proofErr w:type="spellStart"/>
+            <w:r>
+              <w:rPr>
+                <w:rFonts w:eastAsia="Aptos"/>
+                <w:kern w:val="2"/>
+                <w:szCs w:val="24"/>
+              </w:rPr>
+              <w:t>Uvicorn</w:t>
+            </w:r>
+            <w:proofErr w:type="spellEnd"/>
+          </w:p>
+        </w:tc>
+        <w:tc>
+          <w:tcPr>
+            <w:tcW w:w="3288" w:type="dxa"/>
+          </w:tcPr>
+          <w:p>
+            <w:pPr>
+              <w:rPr>
+                <w:rFonts w:eastAsia="Aptos"/>
+                <w:kern w:val="2"/>
+                <w:szCs w:val="24"/>
+              </w:rPr>
+            </w:pPr>
+            <w:r>
+              <w:rPr>
+                <w:rFonts w:eastAsia="Aptos"/>
+                <w:kern w:val="2"/>
+                <w:szCs w:val="24"/>
+              </w:rPr>
+              <w:t>REST API and business logic.</w:t>
+            </w:r>
+          </w:p>
+        </w:tc>
+      </w:tr>
+      <w:tr>
+        <w:tc>
+          <w:tcPr>
+            <w:tcW w:w="3288" w:type="dxa"/>
+          </w:tcPr>
+          <w:p>
+            <w:pPr>
+              <w:rPr>
+                <w:rFonts w:eastAsia="Aptos"/>
+                <w:kern w:val="2"/>
+                <w:szCs w:val="24"/>
+              </w:rPr>
+            </w:pPr>
+            <w:r>
+              <w:rPr>
+                <w:rFonts w:eastAsia="Aptos"/>
+                <w:kern w:val="2"/>
+                <w:szCs w:val="24"/>
+              </w:rPr>
+              <w:t>Database</w:t>
+            </w:r>
+          </w:p>
+        </w:tc>
+        <w:tc>
+          <w:tcPr>
+            <w:tcW w:w="3288" w:type="dxa"/>
+          </w:tcPr>
+          <w:p>
+            <w:pPr>
+              <w:rPr>
+                <w:rFonts w:eastAsia="Aptos"/>
+                <w:kern w:val="2"/>
+                <w:szCs w:val="24"/>
+              </w:rPr>
+            </w:pPr>
+            <w:r>
+              <w:rPr>
+                <w:rFonts w:eastAsia="Aptos"/>
+                <w:kern w:val="2"/>
+                <w:szCs w:val="24"/>
+              </w:rPr>
+              <w:t xml:space="preserve">SQLite via </w:t>
+            </w:r>
+            <w:proofErr w:type="spellStart"/>
+            <w:r>
+              <w:rPr>
+                <w:rFonts w:eastAsia="Aptos"/>
+                <w:kern w:val="2"/>
+                <w:szCs w:val="24"/>
+              </w:rPr>
+              <w:t>SQLAlchemy</w:t>
+            </w:r>
+            <w:proofErr w:type="spellEnd"/>
+            <w:r>
+              <w:rPr>
+                <w:rFonts w:eastAsia="Aptos"/>
+                <w:kern w:val="2"/>
+                <w:szCs w:val="24"/>
+              </w:rPr>
+              <w:t>, with Alembic for schema changes</w:t>
+            </w:r>
+          </w:p>
+        </w:tc>
+        <w:tc>
+          <w:tcPr>
+            <w:tcW w:w="3288" w:type="dxa"/>
+          </w:tcPr>
+          <w:p>
+            <w:pPr>
+              <w:rPr>
+                <w:rFonts w:eastAsia="Aptos"/>
+                <w:kern w:val="2"/>
+                <w:szCs w:val="24"/>
+              </w:rPr>
+            </w:pPr>
+            <w:r>
+              <w:rPr>
+                <w:rFonts w:eastAsia="Aptos"/>
+                <w:kern w:val="2"/>
+                <w:szCs w:val="24"/>
+              </w:rPr>
+              <w:t>Stores users, profiles, schools, reviews, bookmarks and roadmaps.</w:t>
+            </w:r>
+          </w:p>
+        </w:tc>
+      </w:tr>
+      <w:tr>
+        <w:tc>
+          <w:tcPr>
+            <w:tcW w:w="3288" w:type="dxa"/>
+          </w:tcPr>
+          <w:p>
+            <w:pPr>
+              <w:rPr>
+                <w:rFonts w:eastAsia="Aptos"/>
+                <w:kern w:val="2"/>
+                <w:szCs w:val="24"/>
+              </w:rPr>
+            </w:pPr>
+            <w:r>
+              <w:rPr>
+                <w:rFonts w:eastAsia="Aptos"/>
+                <w:kern w:val="2"/>
+                <w:szCs w:val="24"/>
+              </w:rPr>
+              <w:t>Data processing</w:t>
+            </w:r>
+          </w:p>
+        </w:tc>
+        <w:tc>
+          <w:tcPr>
+            <w:tcW w:w="3288" w:type="dxa"/>
+          </w:tcPr>
+          <w:p>
+            <w:pPr>
+              <w:rPr>
+                <w:rFonts w:eastAsia="Aptos"/>
+                <w:kern w:val="2"/>
+                <w:szCs w:val="24"/>
+              </w:rPr>
+            </w:pPr>
+            <w:r>
+              <w:rPr>
+                <w:rFonts w:eastAsia="Aptos"/>
+                <w:kern w:val="2"/>
+                <w:szCs w:val="24"/>
+              </w:rPr>
+              <w:t>pandas</w:t>
+            </w:r>
+          </w:p>
+        </w:tc>
+        <w:tc>
+          <w:tcPr>
+            <w:tcW w:w="3288" w:type="dxa"/>
+          </w:tcPr>
+          <w:p>
+            <w:pPr>
+              <w:rPr>
+                <w:rFonts w:eastAsia="Aptos"/>
+                <w:kern w:val="2"/>
+                <w:szCs w:val="24"/>
+              </w:rPr>
+            </w:pPr>
+            <w:r>
+              <w:rPr>
+                <w:rFonts w:eastAsia="Aptos"/>
+                <w:kern w:val="2"/>
+                <w:szCs w:val="24"/>
+              </w:rPr>
+              <w:t>Reads and cleans the uploaded CSV files.</w:t>
+            </w:r>
+          </w:p>
+        </w:tc>
+      </w:tr>
+      <w:tr>
+        <w:tc>
+          <w:tcPr>
+            <w:tcW w:w="3288" w:type="dxa"/>
+          </w:tcPr>
+          <w:p>
+            <w:pPr>
+              <w:rPr>
+                <w:rFonts w:eastAsia="Aptos"/>
+                <w:kern w:val="2"/>
+                <w:szCs w:val="24"/>
+              </w:rPr>
+            </w:pPr>
+            <w:r>
+              <w:rPr>
+                <w:rFonts w:eastAsia="Aptos"/>
+                <w:kern w:val="2"/>
+                <w:szCs w:val="24"/>
+              </w:rPr>
+              <w:t>Security libraries</w:t>
+            </w:r>
+          </w:p>
+        </w:tc>
+        <w:tc>
+          <w:tcPr>
+            <w:tcW w:w="3288" w:type="dxa"/>
+          </w:tcPr>
+          <w:p>
+            <w:pPr>
+              <w:rPr>
+                <w:rFonts w:eastAsia="Aptos"/>
+                <w:kern w:val="2"/>
+                <w:szCs w:val="24"/>
+              </w:rPr>
+            </w:pPr>
+            <w:proofErr w:type="spellStart"/>
+            <w:r>
+              <w:rPr>
+                <w:rFonts w:eastAsia="Aptos"/>
+                <w:kern w:val="2"/>
+                <w:szCs w:val="24"/>
+              </w:rPr>
+              <w:t>bcrypt</w:t>
+            </w:r>
+            <w:proofErr w:type="spellEnd"/>
+            <w:r>
+              <w:rPr>
+                <w:rFonts w:eastAsia="Aptos"/>
+                <w:kern w:val="2"/>
+                <w:szCs w:val="24"/>
+              </w:rPr>
+              <w:t xml:space="preserve">, </w:t>
+            </w:r>
+            <w:proofErr w:type="spellStart"/>
+            <w:r>
+              <w:rPr>
+                <w:rFonts w:eastAsia="Aptos"/>
+                <w:kern w:val="2"/>
+                <w:szCs w:val="24"/>
+              </w:rPr>
+              <w:t>PyJWT</w:t>
+            </w:r>
+            <w:proofErr w:type="spellEnd"/>
+          </w:p>
+        </w:tc>
+        <w:tc>
+          <w:tcPr>
+            <w:tcW w:w="3288" w:type="dxa"/>
+          </w:tcPr>
+          <w:p>
+            <w:pPr>
+              <w:rPr>
+                <w:rFonts w:eastAsia="Aptos"/>
+                <w:kern w:val="2"/>
+                <w:szCs w:val="24"/>
+              </w:rPr>
+            </w:pPr>
+            <w:r>
+              <w:rPr>
+                <w:rFonts w:eastAsia="Aptos"/>
+                <w:kern w:val="2"/>
+                <w:szCs w:val="24"/>
+              </w:rPr>
+              <w:t>Password hashing and session tokens.</w:t>
+            </w:r>
+          </w:p>
+        </w:tc>
+      </w:tr>
+      <w:tr>
+        <w:tc>
+          <w:tcPr>
+            <w:tcW w:w="3288" w:type="dxa"/>
+          </w:tcPr>
+          <w:p>
+            <w:pPr>
+              <w:rPr>
+                <w:rFonts w:eastAsia="Aptos"/>
+                <w:kern w:val="2"/>
+                <w:szCs w:val="24"/>
+              </w:rPr>
+            </w:pPr>
+            <w:r>
+              <w:rPr>
+                <w:rFonts w:eastAsia="Aptos"/>
+                <w:kern w:val="2"/>
+                <w:szCs w:val="24"/>
+              </w:rPr>
+              <w:t>OpenAI API</w:t>
+            </w:r>
+          </w:p>
+        </w:tc>
+        <w:tc>
+          <w:tcPr>
+            <w:tcW w:w="3288" w:type="dxa"/>
+          </w:tcPr>
+          <w:p>
+            <w:pPr>
+              <w:rPr>
+                <w:rFonts w:eastAsia="Aptos"/>
+                <w:kern w:val="2"/>
+                <w:szCs w:val="24"/>
+              </w:rPr>
+            </w:pPr>
+            <w:r>
+              <w:rPr>
+                <w:rFonts w:eastAsia="Aptos"/>
+                <w:kern w:val="2"/>
+                <w:szCs w:val="24"/>
+              </w:rPr>
+              <w:t>Chat Completions, model set by the OPENAI_MODEL setting</w:t>
+            </w:r>
+          </w:p>
+        </w:tc>
+        <w:tc>
+          <w:tcPr>
+            <w:tcW w:w="3288" w:type="dxa"/>
+          </w:tcPr>
+          <w:p>
+            <w:pPr>
+              <w:rPr>
+                <w:rFonts w:eastAsia="Aptos"/>
+                <w:kern w:val="2"/>
+                <w:szCs w:val="24"/>
+              </w:rPr>
+            </w:pPr>
+            <w:r>
+              <w:rPr>
+                <w:rFonts w:eastAsia="Aptos"/>
+                <w:kern w:val="2"/>
+                <w:szCs w:val="24"/>
+              </w:rPr>
+              <w:t>Generates the AI roadmap.</w:t>
+            </w:r>
+          </w:p>
+        </w:tc>
+      </w:tr>
+      <w:tr>
+        <w:tc>
+          <w:tcPr>
+            <w:tcW w:w="3288" w:type="dxa"/>
+          </w:tcPr>
+          <w:p>
+            <w:pPr>
+              <w:rPr>
+                <w:rFonts w:eastAsia="Aptos"/>
+                <w:kern w:val="2"/>
+                <w:szCs w:val="24"/>
+              </w:rPr>
+            </w:pPr>
+            <w:r>
+              <w:rPr>
+                <w:rFonts w:eastAsia="Aptos"/>
+                <w:kern w:val="2"/>
+                <w:szCs w:val="24"/>
+              </w:rPr>
+              <w:t>Docker and nginx</w:t>
+            </w:r>
+          </w:p>
+        </w:tc>
+        <w:tc>
+          <w:tcPr>
+            <w:tcW w:w="3288" w:type="dxa"/>
+          </w:tcPr>
+          <w:p>
+            <w:pPr>
+              <w:rPr>
+                <w:rFonts w:eastAsia="Aptos"/>
+                <w:kern w:val="2"/>
+                <w:szCs w:val="24"/>
+              </w:rPr>
+            </w:pPr>
+            <w:r>
+              <w:rPr>
+                <w:rFonts w:eastAsia="Aptos"/>
+                <w:kern w:val="2"/>
+                <w:szCs w:val="24"/>
+              </w:rPr>
+              <w:t>Docker containers, nginx web server</w:t>
+            </w:r>
+          </w:p>
+        </w:tc>
+        <w:tc>
+          <w:tcPr>
+            <w:tcW w:w="3288" w:type="dxa"/>
+          </w:tcPr>
+          <w:p>
+            <w:pPr>
+              <w:rPr>
+                <w:rFonts w:eastAsia="Aptos"/>
+                <w:kern w:val="2"/>
+                <w:szCs w:val="24"/>
+              </w:rPr>
+            </w:pPr>
+            <w:r>
+              <w:rPr>
+                <w:rFonts w:eastAsia="Aptos"/>
+                <w:kern w:val="2"/>
+                <w:szCs w:val="24"/>
+              </w:rPr>
+              <w:t>Deployment. nginx serves the frontend and forwards /</w:t>
+            </w:r>
+            <w:proofErr w:type="spellStart"/>
+            <w:r>
+              <w:rPr>
+                <w:rFonts w:eastAsia="Aptos"/>
+                <w:kern w:val="2"/>
+                <w:szCs w:val="24"/>
+              </w:rPr>
+              <w:t>api</w:t>
+            </w:r>
+            <w:proofErr w:type="spellEnd"/>
+            <w:r>
+              <w:rPr>
+                <w:rFonts w:eastAsia="Aptos"/>
+                <w:kern w:val="2"/>
+                <w:szCs w:val="24"/>
+              </w:rPr>
+              <w:t xml:space="preserve"> requests to the backend.</w:t>
+            </w:r>
+          </w:p>
+        </w:tc>
+      </w:tr>
+    </w:tbl>
+    <w:p/>
+    <w:p>
+      <w:pPr>
+        <w:rPr>
+          <w:b/>
+          <w:bCs/>
+        </w:rPr>
+      </w:pPr>
+      <w:r>
+        <w:rPr>
+          <w:b/>
+          <w:bCs/>
+        </w:rPr>
+        <w:t>Data going in and out</w:t>
+      </w:r>
+    </w:p>
+    <w:p/>
+    <w:p>
+      <w:r>
+        <w:rPr>
+          <w:b/>
+          <w:bCs/>
+        </w:rPr>
+        <w:t>Frontend ↔ Backend:</w:t>
+      </w:r>
+      <w:r>
+        <w:t xml:space="preserve"> JSON requests and responses. The data includes login details, profile, school search results, bookmarks, reviews and roadmaps.</w:t>
+      </w:r>
+    </w:p>
+    <w:p/>
+    <w:p>
+      <w:r>
+        <w:rPr>
+          <w:b/>
+          <w:bCs/>
+        </w:rPr>
+        <w:t>Backend → OpenAI:</w:t>
+      </w:r>
+      <w:r>
+        <w:t xml:space="preserve"> a prompt containing the student’s stage, score, postal code and a list of candidate schools. The username is never sent. OpenAI returns a list of school IDs, and the backend keeps only valid ones.</w:t>
+      </w:r>
+    </w:p>
+    <w:p/>
+    <w:p>
+      <w:r>
+        <w:rPr>
+          <w:b/>
+          <w:bCs/>
+        </w:rPr>
+        <w:t>Administrator → Backend:</w:t>
+      </w:r>
+      <w:r>
+        <w:t xml:space="preserve"> the raw school CSV files</w:t>
+      </w:r>
+      <w:r>
+        <w:t xml:space="preserve">, </w:t>
+      </w:r>
+      <w:r>
+        <w:t>uploaded as a multipart form. These are downloaded by the administrator from data.gov.sg beforehand. The system does not fetch them automatically.</w:t>
       </w:r>
     </w:p>
     <w:p>
@@ -3684,7 +4873,7 @@
         <w:spacing w:line="276" w:lineRule="auto"/>
       </w:pPr>
       <w:bookmarkStart w:id="42" w:name="_Toc439994686"/>
-      <w:bookmarkStart w:id="43" w:name="_Toc243827635"/>
+      <w:bookmarkStart w:id="43" w:name="_Toc243844404"/>
       <w:r>
         <w:t>Communications Interfaces</w:t>
       </w:r>
@@ -3692,32 +4881,122 @@
       <w:bookmarkEnd w:id="43"/>
     </w:p>
     <w:p>
-      <w:pPr>
-        <w:pStyle w:val="template"/>
-        <w:spacing w:line="276" w:lineRule="auto"/>
-      </w:pPr>
-      <w:r>
-        <w:t>&lt;Describe the requirements associated with any communications functions required by this product, including e-mail, web browser, network server communications protocols, electronic forms, and so on. Define any pertinent message formatting. Identify any communication standards that will be used, such as FTP or HTTP. Specify any communication security or encryption issues, data transfer rates, and synchronization mechanisms.&gt;</w:t>
-      </w:r>
-    </w:p>
-    <w:p>
-      <w:pPr>
-        <w:spacing w:line="276" w:lineRule="auto"/>
-      </w:pPr>
-    </w:p>
-    <w:p>
-      <w:pPr>
-        <w:spacing w:line="276" w:lineRule="auto"/>
-      </w:pPr>
+      <w:r>
+        <w:rPr>
+          <w:b/>
+          <w:bCs/>
+        </w:rPr>
+        <w:t>Protocol:</w:t>
+      </w:r>
+      <w:r>
+        <w:t xml:space="preserve"> the browser and server communicate over HTTP, with HTTPS used in deployment. The API follows REST and sends JSON. File uploads use multipart/form-data.</w:t>
+      </w:r>
+    </w:p>
+    <w:p/>
+    <w:p>
+      <w:r>
+        <w:rPr>
+          <w:b/>
+          <w:bCs/>
+        </w:rPr>
+        <w:t>Same-origin setup:</w:t>
+      </w:r>
+      <w:r>
+        <w:t xml:space="preserve"> in deployment, nginx forwards /</w:t>
+      </w:r>
+      <w:proofErr w:type="spellStart"/>
+      <w:r>
+        <w:t>api</w:t>
+      </w:r>
+      <w:proofErr w:type="spellEnd"/>
+      <w:r>
+        <w:t>/ requests to the backend, so the browser talks to one address. Cross-origin requests are limited to the one configured frontend address (CORS).</w:t>
+      </w:r>
+    </w:p>
+    <w:p/>
+    <w:p>
+      <w:r>
+        <w:rPr>
+          <w:b/>
+          <w:bCs/>
+        </w:rPr>
+        <w:t>Authentication:</w:t>
+      </w:r>
+      <w:r>
+        <w:t xml:space="preserve"> protected requests carry an Authorization: Bearer &lt;access token&gt; header. Access tokens expire after 5 minutes. A single-use refresh token (valid for 7 days) gets a new pair when the access token expires.</w:t>
+      </w:r>
+    </w:p>
+    <w:p/>
+    <w:p>
+      <w:r>
+        <w:rPr>
+          <w:b/>
+          <w:bCs/>
+        </w:rPr>
+        <w:lastRenderedPageBreak/>
+        <w:t>Security:</w:t>
+      </w:r>
+      <w:r>
+        <w:t xml:space="preserve"> passwords are hashed (</w:t>
+      </w:r>
+      <w:proofErr w:type="spellStart"/>
+      <w:r>
+        <w:t>bcrypt</w:t>
+      </w:r>
+      <w:proofErr w:type="spellEnd"/>
+      <w:r>
+        <w:t>) before storage. Refresh tokens are stored only as hashes. All text inputs are validated and cleaned on the backend. Traffic should go over HTTPS so that passwords and tokens are encrypted in transit.</w:t>
+      </w:r>
+    </w:p>
+    <w:p/>
+    <w:p>
+      <w:r>
+        <w:rPr>
+          <w:b/>
+          <w:bCs/>
+        </w:rPr>
+        <w:t>Error format:</w:t>
+      </w:r>
+      <w:r>
+        <w:t xml:space="preserve"> failures </w:t>
+      </w:r>
+      <w:proofErr w:type="gramStart"/>
+      <w:r>
+        <w:t>return {"</w:t>
+      </w:r>
+      <w:proofErr w:type="gramEnd"/>
+      <w:r>
+        <w:t>detail": "&lt;message</w:t>
+      </w:r>
+      <w:proofErr w:type="gramStart"/>
+      <w:r>
+        <w:t>&gt;"}</w:t>
+      </w:r>
+      <w:proofErr w:type="gramEnd"/>
+      <w:r>
+        <w:t xml:space="preserve"> with a matching HTTP status code (for example, 401 not logged in, 403 not an admin, 409 conflict, 422 invalid input, 503 service unavailable).</w:t>
+      </w:r>
+    </w:p>
+    <w:p/>
+    <w:p>
+      <w:r>
+        <w:rPr>
+          <w:b/>
+          <w:bCs/>
+        </w:rPr>
+        <w:t>OpenAI:</w:t>
+      </w:r>
+      <w:r>
+        <w:t xml:space="preserve"> the backend calls the OpenAI API over HTTPS. It gives up after 14 seconds, so the frontend’s 15-second limit (PERF-7) is not reached. Failures return 503, or 504 for a timeout.</w:t>
+      </w:r>
     </w:p>
     <w:p>
       <w:pPr>
         <w:pStyle w:val="Heading1"/>
         <w:spacing w:line="276" w:lineRule="auto"/>
       </w:pPr>
-      <w:bookmarkStart w:id="44" w:name="_Toc243827636"/>
-      <w:r>
-        <w:lastRenderedPageBreak/>
+      <w:bookmarkStart w:id="44" w:name="_Toc243844405"/>
+      <w:r>
         <w:t>System Features</w:t>
       </w:r>
       <w:bookmarkEnd w:id="44"/>
@@ -3727,7 +5006,7 @@
         <w:pStyle w:val="Heading2"/>
         <w:spacing w:line="276" w:lineRule="auto"/>
       </w:pPr>
-      <w:bookmarkStart w:id="45" w:name="_Toc243827637"/>
+      <w:bookmarkStart w:id="45" w:name="_Toc243844406"/>
       <w:r>
         <w:t>Detailed School Directory &amp; Profile Viewer</w:t>
       </w:r>
@@ -3926,6 +5205,7 @@
           <w:b/>
           <w:bCs/>
         </w:rPr>
+        <w:lastRenderedPageBreak/>
         <w:t>User Action:</w:t>
       </w:r>
       <w:r>
@@ -3981,7 +5261,6 @@
         <w:spacing w:line="276" w:lineRule="auto"/>
       </w:pPr>
       <w:r>
-        <w:lastRenderedPageBreak/>
         <w:t>Alternative Flow: Invalid/Zero Match Search</w:t>
       </w:r>
     </w:p>
@@ -4341,6 +5620,7 @@
               <w:rPr>
                 <w:rFonts w:ascii="Times" w:hAnsi="Times" w:cs="Times"/>
               </w:rPr>
+              <w:lastRenderedPageBreak/>
               <w:t>programme</w:t>
             </w:r>
             <w:proofErr w:type="spellEnd"/>
@@ -4386,14 +5666,7 @@
               <w:rPr>
                 <w:rFonts w:ascii="Times" w:hAnsi="Times" w:cs="Times"/>
               </w:rPr>
-              <w:t xml:space="preserve">Acceptable Inputs: The search input shall accept </w:t>
-            </w:r>
-            <w:r>
-              <w:rPr>
-                <w:rFonts w:ascii="Times" w:hAnsi="Times" w:cs="Times"/>
-              </w:rPr>
-              <w:lastRenderedPageBreak/>
-              <w:t>strings containing letters (A-Z, a-z), numbers (0-9), single spaces, hyphens, periods, and apostrophes.</w:t>
+              <w:t>Acceptable Inputs: The search input shall accept strings containing letters (A-Z, a-z), numbers (0-9), single spaces, hyphens, periods, and apostrophes.</w:t>
             </w:r>
           </w:p>
           <w:p>
@@ -4468,7 +5741,25 @@
                 <w:kern w:val="2"/>
                 <w:szCs w:val="24"/>
               </w:rPr>
-              <w:t>Strings consisting solely of non-alphanumeric symbols or code syntax (e.g., "&lt;script&gt;", "SELECT * FROM", ";--").</w:t>
+              <w:t xml:space="preserve">Strings consisting solely of non-alphanumeric symbols or code syntax (e.g., "&lt;script&gt;", "SELECT * FROM", </w:t>
+            </w:r>
+            <w:proofErr w:type="gramStart"/>
+            <w:r>
+              <w:rPr>
+                <w:rFonts w:eastAsia="Aptos" w:cs="Times"/>
+                <w:kern w:val="2"/>
+                <w:szCs w:val="24"/>
+              </w:rPr>
+              <w:t>";--</w:t>
+            </w:r>
+            <w:proofErr w:type="gramEnd"/>
+            <w:r>
+              <w:rPr>
+                <w:rFonts w:eastAsia="Aptos" w:cs="Times"/>
+                <w:kern w:val="2"/>
+                <w:szCs w:val="24"/>
+              </w:rPr>
+              <w:t>").</w:t>
             </w:r>
           </w:p>
         </w:tc>
@@ -4868,6 +6159,7 @@
               <w:spacing w:before="100" w:after="100" w:line="276" w:lineRule="auto"/>
             </w:pPr>
             <w:r>
+              <w:lastRenderedPageBreak/>
               <w:t>Proximity Distance (Ascending)</w:t>
             </w:r>
           </w:p>
@@ -4893,6 +6185,7 @@
                 <w:kern w:val="2"/>
                 <w:szCs w:val="24"/>
               </w:rPr>
+              <w:lastRenderedPageBreak/>
               <w:t>REQ-1.7</w:t>
             </w:r>
           </w:p>
@@ -5030,7 +6323,6 @@
                 <w:kern w:val="2"/>
                 <w:szCs w:val="24"/>
               </w:rPr>
-              <w:lastRenderedPageBreak/>
               <w:t>REQ-1.8</w:t>
             </w:r>
           </w:p>
@@ -5424,6 +6716,7 @@
                 <w:kern w:val="2"/>
                 <w:szCs w:val="24"/>
               </w:rPr>
+              <w:lastRenderedPageBreak/>
               <w:t>REQ-1.12</w:t>
             </w:r>
           </w:p>
@@ -5589,16 +6882,7 @@
                 <w:kern w:val="2"/>
                 <w:szCs w:val="24"/>
               </w:rPr>
-              <w:t xml:space="preserve">Zero-Results </w:t>
-            </w:r>
-            <w:r>
-              <w:rPr>
-                <w:rFonts w:eastAsia="Aptos"/>
-                <w:kern w:val="2"/>
-                <w:szCs w:val="24"/>
-              </w:rPr>
-              <w:lastRenderedPageBreak/>
-              <w:t>Behavior</w:t>
+              <w:t>Zero-Results Behavior</w:t>
             </w:r>
           </w:p>
         </w:tc>
@@ -5621,17 +6905,7 @@
                 <w:kern w:val="2"/>
                 <w:szCs w:val="24"/>
               </w:rPr>
-              <w:lastRenderedPageBreak/>
-              <w:t xml:space="preserve">If a search/filter query yields zero results, the system shall display a user-friendly text notification: "No schools match </w:t>
-            </w:r>
-            <w:r>
-              <w:rPr>
-                <w:rFonts w:eastAsia="Aptos"/>
-                <w:kern w:val="2"/>
-                <w:szCs w:val="24"/>
-              </w:rPr>
-              <w:lastRenderedPageBreak/>
-              <w:t>your search criteria. Try clearing filters or adjusting your search keywords."</w:t>
+              <w:t>If a search/filter query yields zero results, the system shall display a user-friendly text notification: "No schools match your search criteria. Try clearing filters or adjusting your search keywords."</w:t>
             </w:r>
           </w:p>
         </w:tc>
@@ -5656,7 +6930,6 @@
                 <w:kern w:val="2"/>
                 <w:szCs w:val="24"/>
               </w:rPr>
-              <w:lastRenderedPageBreak/>
               <w:t>REQ-1.15</w:t>
             </w:r>
           </w:p>
@@ -5724,7 +6997,7 @@
         <w:pStyle w:val="Heading2"/>
         <w:spacing w:line="276" w:lineRule="auto"/>
       </w:pPr>
-      <w:bookmarkStart w:id="46" w:name="_Toc243827638"/>
+      <w:bookmarkStart w:id="46" w:name="_Toc243844407"/>
       <w:r>
         <w:t>User Account &amp; Privacy-Centric Student Profile Management</w:t>
       </w:r>
@@ -5866,6 +7139,7 @@
         <w:spacing w:line="276" w:lineRule="auto"/>
       </w:pPr>
       <w:r>
+        <w:lastRenderedPageBreak/>
         <w:t>Alternative Flow: Username Containing Special Characters</w:t>
       </w:r>
     </w:p>
@@ -5938,7 +7212,6 @@
         <w:spacing w:line="276" w:lineRule="auto"/>
       </w:pPr>
       <w:r>
-        <w:lastRenderedPageBreak/>
         <w:t>Alternative Flow: Invalid Password Submission</w:t>
       </w:r>
     </w:p>
@@ -6024,7 +7297,15 @@
         <w:t>User Action:</w:t>
       </w:r>
       <w:r>
-        <w:t xml:space="preserve"> The user navigates to Profile Settings and selects an upcoming transition stage under "Target Education Level".  </w:t>
+        <w:t xml:space="preserve"> The user </w:t>
+      </w:r>
+      <w:proofErr w:type="gramStart"/>
+      <w:r>
+        <w:t>navigates to</w:t>
+      </w:r>
+      <w:proofErr w:type="gramEnd"/>
+      <w:r>
+        <w:t xml:space="preserve"> Profile Settings and selects an upcoming transition stage under "Target Education Level".  </w:t>
       </w:r>
     </w:p>
     <w:p>
@@ -6160,6 +7441,7 @@
           <w:b/>
           <w:bCs/>
         </w:rPr>
+        <w:lastRenderedPageBreak/>
         <w:t>System Response:</w:t>
       </w:r>
       <w:r>
@@ -6252,7 +7534,6 @@
         <w:spacing w:line="276" w:lineRule="auto"/>
       </w:pPr>
       <w:r>
-        <w:lastRenderedPageBreak/>
         <w:t>Main Flow 3: Managing Bookmarked Schools</w:t>
       </w:r>
     </w:p>
@@ -6581,7 +7862,25 @@
                 <w:kern w:val="2"/>
                 <w:szCs w:val="24"/>
               </w:rPr>
-              <w:t xml:space="preserve">The system shall allow users to register, log in, and log out using a unique Username and Password combination.  </w:t>
+              <w:t xml:space="preserve">The </w:t>
+            </w:r>
+            <w:proofErr w:type="gramStart"/>
+            <w:r>
+              <w:rPr>
+                <w:rFonts w:eastAsia="Aptos"/>
+                <w:kern w:val="2"/>
+                <w:szCs w:val="24"/>
+              </w:rPr>
+              <w:t>system shall</w:t>
+            </w:r>
+            <w:proofErr w:type="gramEnd"/>
+            <w:r>
+              <w:rPr>
+                <w:rFonts w:eastAsia="Aptos"/>
+                <w:kern w:val="2"/>
+                <w:szCs w:val="24"/>
+              </w:rPr>
+              <w:t xml:space="preserve"> allow users to register, log in, and log out using a unique Username and Password combination.  </w:t>
             </w:r>
           </w:p>
         </w:tc>
@@ -6677,6 +7976,7 @@
                 <w:kern w:val="2"/>
                 <w:szCs w:val="24"/>
               </w:rPr>
+              <w:lastRenderedPageBreak/>
               <w:t>REQ-2.3</w:t>
             </w:r>
           </w:p>
@@ -6723,7 +8023,25 @@
                 <w:kern w:val="2"/>
                 <w:szCs w:val="24"/>
               </w:rPr>
-              <w:t xml:space="preserve">The system shall enforce password security rules requiring a minimum length of 8 characters, containing at least one numeric digit (0-9) and at least one special character (e.g., !@#$%^&amp;*).  </w:t>
+              <w:t>The system shall enforce password security rules requiring a minimum length of 8 characters, containing at least one numeric digit (0-9) and at least one special character (e.g.</w:t>
+            </w:r>
+            <w:proofErr w:type="gramStart"/>
+            <w:r>
+              <w:rPr>
+                <w:rFonts w:eastAsia="Aptos"/>
+                <w:kern w:val="2"/>
+                <w:szCs w:val="24"/>
+              </w:rPr>
+              <w:t>, !</w:t>
+            </w:r>
+            <w:proofErr w:type="gramEnd"/>
+            <w:r>
+              <w:rPr>
+                <w:rFonts w:eastAsia="Aptos"/>
+                <w:kern w:val="2"/>
+                <w:szCs w:val="24"/>
+              </w:rPr>
+              <w:t xml:space="preserve">@#$%^&amp;*).  </w:t>
             </w:r>
           </w:p>
         </w:tc>
@@ -6794,7 +8112,25 @@
                 <w:kern w:val="2"/>
                 <w:szCs w:val="24"/>
               </w:rPr>
-              <w:t>The system shall hash all user passwords on the backend database before storing using a secure cryptographic hashing algorithm.</w:t>
+              <w:t xml:space="preserve">The system shall </w:t>
+            </w:r>
+            <w:proofErr w:type="gramStart"/>
+            <w:r>
+              <w:rPr>
+                <w:rFonts w:eastAsia="Aptos"/>
+                <w:kern w:val="2"/>
+                <w:szCs w:val="24"/>
+              </w:rPr>
+              <w:t>hash</w:t>
+            </w:r>
+            <w:proofErr w:type="gramEnd"/>
+            <w:r>
+              <w:rPr>
+                <w:rFonts w:eastAsia="Aptos"/>
+                <w:kern w:val="2"/>
+                <w:szCs w:val="24"/>
+              </w:rPr>
+              <w:t xml:space="preserve"> all user passwords on the backend database before storing using a secure cryptographic hashing algorithm.</w:t>
             </w:r>
           </w:p>
         </w:tc>
@@ -6842,16 +8178,7 @@
                 <w:kern w:val="2"/>
                 <w:szCs w:val="24"/>
               </w:rPr>
-              <w:t xml:space="preserve">Strict PII </w:t>
-            </w:r>
-            <w:r>
-              <w:rPr>
-                <w:rFonts w:eastAsia="Aptos"/>
-                <w:kern w:val="2"/>
-                <w:szCs w:val="24"/>
-              </w:rPr>
-              <w:lastRenderedPageBreak/>
-              <w:t>Prohibition</w:t>
+              <w:t>Strict PII Prohibition</w:t>
             </w:r>
           </w:p>
         </w:tc>
@@ -6874,17 +8201,7 @@
                 <w:kern w:val="2"/>
                 <w:szCs w:val="24"/>
               </w:rPr>
-              <w:lastRenderedPageBreak/>
-              <w:t xml:space="preserve">The system shall explicitly exclude fields for personally identifiable information; it shall not collect, request, or </w:t>
-            </w:r>
-            <w:r>
-              <w:rPr>
-                <w:rFonts w:eastAsia="Aptos"/>
-                <w:kern w:val="2"/>
-                <w:szCs w:val="24"/>
-              </w:rPr>
-              <w:lastRenderedPageBreak/>
-              <w:t>store real names, age, exact dates of birth, or national identification numbers (NRIC/FIN).</w:t>
+              <w:t>The system shall explicitly exclude fields for personally identifiable information; it shall not collect, request, or store real names, age, exact dates of birth, or national identification numbers (NRIC/FIN).</w:t>
             </w:r>
           </w:p>
         </w:tc>
@@ -6909,7 +8226,6 @@
                 <w:kern w:val="2"/>
                 <w:szCs w:val="24"/>
               </w:rPr>
-              <w:lastRenderedPageBreak/>
               <w:t>REQ-2.6</w:t>
             </w:r>
           </w:p>
@@ -7198,6 +8514,7 @@
               <w:spacing w:before="100" w:after="100" w:line="276" w:lineRule="auto"/>
             </w:pPr>
             <w:r>
+              <w:lastRenderedPageBreak/>
               <w:t xml:space="preserve">Polytechnic Cumulative GPA must be a floating-point number between 0.00 and 4.00 inclusive.  </w:t>
             </w:r>
           </w:p>
@@ -7236,6 +8553,7 @@
                 <w:kern w:val="2"/>
                 <w:szCs w:val="24"/>
               </w:rPr>
+              <w:lastRenderedPageBreak/>
               <w:t>REQ-2.9</w:t>
             </w:r>
           </w:p>
@@ -7330,16 +8648,7 @@
                 <w:kern w:val="2"/>
                 <w:szCs w:val="24"/>
               </w:rPr>
-              <w:t xml:space="preserve">Default Proximity </w:t>
-            </w:r>
-            <w:r>
-              <w:rPr>
-                <w:rFonts w:eastAsia="Aptos"/>
-                <w:kern w:val="2"/>
-                <w:szCs w:val="24"/>
-              </w:rPr>
-              <w:lastRenderedPageBreak/>
-              <w:t>Anchor</w:t>
+              <w:t>Default Proximity Anchor</w:t>
             </w:r>
           </w:p>
         </w:tc>
@@ -7362,17 +8671,7 @@
                 <w:kern w:val="2"/>
                 <w:szCs w:val="24"/>
               </w:rPr>
-              <w:lastRenderedPageBreak/>
-              <w:t xml:space="preserve">The system shall store the validated 6-digit postal code in </w:t>
-            </w:r>
-            <w:r>
-              <w:rPr>
-                <w:rFonts w:eastAsia="Aptos"/>
-                <w:kern w:val="2"/>
-                <w:szCs w:val="24"/>
-              </w:rPr>
-              <w:lastRenderedPageBreak/>
-              <w:t>the user profile and automatically set it as the default origin point for all automated distance and radius calculations across the system.</w:t>
+              <w:t>The system shall store the validated 6-digit postal code in the user profile and automatically set it as the default origin point for all automated distance and radius calculations across the system.</w:t>
             </w:r>
           </w:p>
         </w:tc>
@@ -7397,7 +8696,6 @@
                 <w:kern w:val="2"/>
                 <w:szCs w:val="24"/>
               </w:rPr>
-              <w:lastRenderedPageBreak/>
               <w:t>REQ-2.11</w:t>
             </w:r>
           </w:p>
@@ -7515,7 +8813,25 @@
                 <w:kern w:val="2"/>
                 <w:szCs w:val="24"/>
               </w:rPr>
-              <w:t xml:space="preserve">The system shall provide a dedicated profile dashboard section displaying all saved institutions.  </w:t>
+              <w:t xml:space="preserve">The system </w:t>
+            </w:r>
+            <w:proofErr w:type="gramStart"/>
+            <w:r>
+              <w:rPr>
+                <w:rFonts w:eastAsia="Aptos"/>
+                <w:kern w:val="2"/>
+                <w:szCs w:val="24"/>
+              </w:rPr>
+              <w:t>shall</w:t>
+            </w:r>
+            <w:proofErr w:type="gramEnd"/>
+            <w:r>
+              <w:rPr>
+                <w:rFonts w:eastAsia="Aptos"/>
+                <w:kern w:val="2"/>
+                <w:szCs w:val="24"/>
+              </w:rPr>
+              <w:t xml:space="preserve"> provide a dedicated profile dashboard section displaying all saved institutions.  </w:t>
             </w:r>
           </w:p>
         </w:tc>
@@ -7757,7 +9073,16 @@
                 <w:kern w:val="2"/>
                 <w:szCs w:val="24"/>
               </w:rPr>
-              <w:t>Duplicate Username Prevention</w:t>
+              <w:t xml:space="preserve">Duplicate Username </w:t>
+            </w:r>
+            <w:r>
+              <w:rPr>
+                <w:rFonts w:eastAsia="Aptos"/>
+                <w:kern w:val="2"/>
+                <w:szCs w:val="24"/>
+              </w:rPr>
+              <w:lastRenderedPageBreak/>
+              <w:t>Prevention</w:t>
             </w:r>
           </w:p>
         </w:tc>
@@ -7780,7 +9105,17 @@
                 <w:kern w:val="2"/>
                 <w:szCs w:val="24"/>
               </w:rPr>
-              <w:t>If a user attempts to register with a username that already exists in the database, the system shall block registration and display an error message: "Username is already taken. Please choose a different username."</w:t>
+              <w:lastRenderedPageBreak/>
+              <w:t xml:space="preserve">If a user attempts to register with a username that already exists in the database, the system shall block registration </w:t>
+            </w:r>
+            <w:r>
+              <w:rPr>
+                <w:rFonts w:eastAsia="Aptos"/>
+                <w:kern w:val="2"/>
+                <w:szCs w:val="24"/>
+              </w:rPr>
+              <w:lastRenderedPageBreak/>
+              <w:t>and display an error message: "Username is already taken. Please choose a different username."</w:t>
             </w:r>
           </w:p>
         </w:tc>
@@ -7805,6 +9140,7 @@
                 <w:kern w:val="2"/>
                 <w:szCs w:val="24"/>
               </w:rPr>
+              <w:lastRenderedPageBreak/>
               <w:t>REQ-2.16</w:t>
             </w:r>
           </w:p>
@@ -7947,7 +9283,6 @@
                 <w:kern w:val="2"/>
                 <w:szCs w:val="24"/>
               </w:rPr>
-              <w:lastRenderedPageBreak/>
               <w:t>REQ-2.18</w:t>
             </w:r>
           </w:p>
@@ -7994,7 +9329,25 @@
                 <w:kern w:val="2"/>
                 <w:szCs w:val="24"/>
               </w:rPr>
-              <w:t>If a user enters a username containing special characters during registration, the system shall prevent account creation and display an error message: "Username cannot contain special characters. Please use only letters and numbers."</w:t>
+              <w:t xml:space="preserve">If a user enters a username containing special characters during registration, the system </w:t>
+            </w:r>
+            <w:proofErr w:type="gramStart"/>
+            <w:r>
+              <w:rPr>
+                <w:rFonts w:eastAsia="Aptos"/>
+                <w:kern w:val="2"/>
+                <w:szCs w:val="24"/>
+              </w:rPr>
+              <w:t>shall</w:t>
+            </w:r>
+            <w:proofErr w:type="gramEnd"/>
+            <w:r>
+              <w:rPr>
+                <w:rFonts w:eastAsia="Aptos"/>
+                <w:kern w:val="2"/>
+                <w:szCs w:val="24"/>
+              </w:rPr>
+              <w:t xml:space="preserve"> prevent account creation and display an error message: "Username cannot contain special characters. Please use only letters and numbers."</w:t>
             </w:r>
           </w:p>
         </w:tc>
@@ -8020,7 +9373,7 @@
         <w:pStyle w:val="Heading2"/>
         <w:spacing w:line="276" w:lineRule="auto"/>
       </w:pPr>
-      <w:bookmarkStart w:id="47" w:name="_Toc243827639"/>
+      <w:bookmarkStart w:id="47" w:name="_Toc243844408"/>
       <w:r>
         <w:t>Education Roadmap Generator &amp; Manager</w:t>
       </w:r>
@@ -8152,6 +9505,7 @@
           <w:b/>
           <w:bCs/>
         </w:rPr>
+        <w:lastRenderedPageBreak/>
         <w:t>System Response:</w:t>
       </w:r>
       <w:r>
@@ -8258,7 +9612,6 @@
         <w:spacing w:line="276" w:lineRule="auto"/>
       </w:pPr>
       <w:r>
-        <w:lastRenderedPageBreak/>
         <w:t>Alternative Flow: Missing Postal Code Precondition</w:t>
       </w:r>
     </w:p>
@@ -8431,7 +9784,15 @@
         <w:t>, “</w:t>
       </w:r>
       <w:r>
-        <w:t>Unable to generate AI recommendation at this time. Please try again.</w:t>
+        <w:t xml:space="preserve">Unable to generate AI recommendation </w:t>
+      </w:r>
+      <w:proofErr w:type="gramStart"/>
+      <w:r>
+        <w:t>at this time</w:t>
+      </w:r>
+      <w:proofErr w:type="gramEnd"/>
+      <w:r>
+        <w:t>. Please try again.</w:t>
       </w:r>
       <w:r>
         <w:t>”</w:t>
@@ -8521,6 +9882,7 @@
           <w:b/>
           <w:bCs/>
         </w:rPr>
+        <w:lastRenderedPageBreak/>
         <w:t>User Action:</w:t>
       </w:r>
       <w:r>
@@ -8623,7 +9985,6 @@
           <w:b/>
           <w:bCs/>
         </w:rPr>
-        <w:lastRenderedPageBreak/>
         <w:t>System Response:</w:t>
       </w:r>
       <w:r>
@@ -8875,6 +10236,7 @@
         <w:spacing w:line="276" w:lineRule="auto"/>
       </w:pPr>
       <w:r>
+        <w:lastRenderedPageBreak/>
         <w:t>Alternative Flow: Cancel Edit Action</w:t>
       </w:r>
     </w:p>
@@ -9372,6 +10734,7 @@
               <w:spacing w:before="100" w:after="100" w:line="276" w:lineRule="auto"/>
             </w:pPr>
             <w:r>
+              <w:lastRenderedPageBreak/>
               <w:t xml:space="preserve">Preschool </w:t>
             </w:r>
             <w:r>
@@ -9588,7 +10951,25 @@
                 <w:kern w:val="2"/>
                 <w:szCs w:val="24"/>
               </w:rPr>
-              <w:t xml:space="preserve">The system shall allow logged-in users to save generated roadmaps (either Rule-Based or AI-Generated) to their profile dashboard.  </w:t>
+              <w:t xml:space="preserve">The </w:t>
+            </w:r>
+            <w:proofErr w:type="gramStart"/>
+            <w:r>
+              <w:rPr>
+                <w:rFonts w:eastAsia="Aptos"/>
+                <w:kern w:val="2"/>
+                <w:szCs w:val="24"/>
+              </w:rPr>
+              <w:t>system shall</w:t>
+            </w:r>
+            <w:proofErr w:type="gramEnd"/>
+            <w:r>
+              <w:rPr>
+                <w:rFonts w:eastAsia="Aptos"/>
+                <w:kern w:val="2"/>
+                <w:szCs w:val="24"/>
+              </w:rPr>
+              <w:t xml:space="preserve"> allow logged-in users to save generated roadmaps (either Rule-Based or AI-Generated) to their profile dashboard.  </w:t>
             </w:r>
           </w:p>
         </w:tc>
@@ -9659,7 +11040,25 @@
                 <w:kern w:val="2"/>
                 <w:szCs w:val="24"/>
               </w:rPr>
-              <w:t>The system shall allow users to manually edit saved roadmaps by modifying individual school nodes.</w:t>
+              <w:t xml:space="preserve">The </w:t>
+            </w:r>
+            <w:proofErr w:type="gramStart"/>
+            <w:r>
+              <w:rPr>
+                <w:rFonts w:eastAsia="Aptos"/>
+                <w:kern w:val="2"/>
+                <w:szCs w:val="24"/>
+              </w:rPr>
+              <w:t>system shall</w:t>
+            </w:r>
+            <w:proofErr w:type="gramEnd"/>
+            <w:r>
+              <w:rPr>
+                <w:rFonts w:eastAsia="Aptos"/>
+                <w:kern w:val="2"/>
+                <w:szCs w:val="24"/>
+              </w:rPr>
+              <w:t xml:space="preserve"> allow users to manually edit saved roadmaps by modifying individual school nodes.</w:t>
             </w:r>
           </w:p>
         </w:tc>
@@ -9943,7 +11342,16 @@
                 <w:kern w:val="2"/>
                 <w:szCs w:val="24"/>
               </w:rPr>
-              <w:t>The system shall provide an interactive "Retry AI Generation" control within the AI roadmap section upon an error state, enabling the user to manually re-trigger the AI generation request without affecting the displayed Rule-Based Plan.</w:t>
+              <w:t>The system shall provide an interactive "Retry AI Generation" control within the AI roadmap section upon an error state, enabling the user to manually re-trigger the AI generation request without affecting the displayed Rule-</w:t>
+            </w:r>
+            <w:r>
+              <w:rPr>
+                <w:rFonts w:eastAsia="Aptos"/>
+                <w:kern w:val="2"/>
+                <w:szCs w:val="24"/>
+              </w:rPr>
+              <w:lastRenderedPageBreak/>
+              <w:t>Based Plan.</w:t>
             </w:r>
           </w:p>
         </w:tc>
@@ -9968,6 +11376,7 @@
                 <w:kern w:val="2"/>
                 <w:szCs w:val="24"/>
               </w:rPr>
+              <w:lastRenderedPageBreak/>
               <w:t>REQ-3.10</w:t>
             </w:r>
           </w:p>
@@ -10133,16 +11542,7 @@
                 <w:kern w:val="2"/>
                 <w:szCs w:val="24"/>
               </w:rPr>
-              <w:t xml:space="preserve">Profile Postal Code </w:t>
-            </w:r>
-            <w:r>
-              <w:rPr>
-                <w:rFonts w:eastAsia="Aptos"/>
-                <w:kern w:val="2"/>
-                <w:szCs w:val="24"/>
-              </w:rPr>
-              <w:lastRenderedPageBreak/>
-              <w:t>Precondition Check</w:t>
+              <w:t>Profile Postal Code Precondition Check</w:t>
             </w:r>
           </w:p>
         </w:tc>
@@ -10165,17 +11565,7 @@
                 <w:kern w:val="2"/>
                 <w:szCs w:val="24"/>
               </w:rPr>
-              <w:lastRenderedPageBreak/>
-              <w:t xml:space="preserve">Prior to initiating roadmap generation, the system shall </w:t>
-            </w:r>
-            <w:r>
-              <w:rPr>
-                <w:rFonts w:eastAsia="Aptos"/>
-                <w:kern w:val="2"/>
-                <w:szCs w:val="24"/>
-              </w:rPr>
-              <w:lastRenderedPageBreak/>
-              <w:t xml:space="preserve">verify the presence of a valid 6-digit postal code in the user profile; if missing, the system shall display a popup notification directing the user to complete their profile setup.  </w:t>
+              <w:t xml:space="preserve">Prior to initiating roadmap generation, the system shall verify the presence of a valid 6-digit postal code in the user profile; if missing, the system shall display a popup notification directing the user to complete their profile setup.  </w:t>
             </w:r>
           </w:p>
         </w:tc>
@@ -10200,7 +11590,6 @@
                 <w:kern w:val="2"/>
                 <w:szCs w:val="24"/>
               </w:rPr>
-              <w:lastRenderedPageBreak/>
               <w:t>REQ-3.13</w:t>
             </w:r>
           </w:p>
@@ -10460,7 +11849,25 @@
                 <w:kern w:val="2"/>
                 <w:szCs w:val="24"/>
               </w:rPr>
-              <w:t>If no saved roadmap exists in the user account, the system shall render an empty state screen with a prominent "Generate Roadmap" action button.</w:t>
+              <w:t xml:space="preserve">If no saved roadmap exists in the user account, the system </w:t>
+            </w:r>
+            <w:proofErr w:type="gramStart"/>
+            <w:r>
+              <w:rPr>
+                <w:rFonts w:eastAsia="Aptos"/>
+                <w:kern w:val="2"/>
+                <w:szCs w:val="24"/>
+              </w:rPr>
+              <w:t>shall</w:t>
+            </w:r>
+            <w:proofErr w:type="gramEnd"/>
+            <w:r>
+              <w:rPr>
+                <w:rFonts w:eastAsia="Aptos"/>
+                <w:kern w:val="2"/>
+                <w:szCs w:val="24"/>
+              </w:rPr>
+              <w:t xml:space="preserve"> render an empty state screen with a prominent "Generate Roadmap" action button.</w:t>
             </w:r>
           </w:p>
         </w:tc>
@@ -10481,7 +11888,7 @@
         <w:pStyle w:val="Heading2"/>
         <w:spacing w:line="276" w:lineRule="auto"/>
       </w:pPr>
-      <w:bookmarkStart w:id="48" w:name="_Toc243827640"/>
+      <w:bookmarkStart w:id="48" w:name="_Toc243844409"/>
       <w:r>
         <w:t>User School Review System</w:t>
       </w:r>
@@ -10505,6 +11912,7 @@
           <w:b/>
           <w:bCs/>
         </w:rPr>
+        <w:lastRenderedPageBreak/>
         <w:t>Description:</w:t>
       </w:r>
       <w:r>
@@ -10595,7 +12003,6 @@
           <w:b/>
           <w:bCs/>
         </w:rPr>
-        <w:lastRenderedPageBreak/>
         <w:t>System Response:</w:t>
       </w:r>
       <w:r>
@@ -10837,6 +12244,7 @@
         <w:spacing w:line="276" w:lineRule="auto"/>
       </w:pPr>
       <w:r>
+        <w:lastRenderedPageBreak/>
         <w:t>Alternative Flow: Existing User Review Detection</w:t>
       </w:r>
     </w:p>
@@ -10935,7 +12343,6 @@
           <w:b/>
           <w:bCs/>
         </w:rPr>
-        <w:lastRenderedPageBreak/>
         <w:t>System Response:</w:t>
       </w:r>
       <w:r>
@@ -11175,6 +12582,7 @@
           <w:b/>
           <w:bCs/>
         </w:rPr>
+        <w:lastRenderedPageBreak/>
         <w:t>System Response:</w:t>
       </w:r>
       <w:r>
@@ -11394,7 +12802,6 @@
                 <w:kern w:val="2"/>
                 <w:szCs w:val="24"/>
               </w:rPr>
-              <w:lastRenderedPageBreak/>
               <w:t>REQ-4.2</w:t>
             </w:r>
           </w:p>
@@ -11538,7 +12945,25 @@
                 <w:kern w:val="2"/>
                 <w:szCs w:val="24"/>
               </w:rPr>
-              <w:t xml:space="preserve">The system shall display all approved user reviews on the corresponding school profile page, showing the reviewer's username, submission timestamp, and review text body.  </w:t>
+              <w:t xml:space="preserve">The system shall display all approved user reviews on the corresponding school profile page, showing the reviewer's username, submission timestamp, and </w:t>
+            </w:r>
+            <w:proofErr w:type="gramStart"/>
+            <w:r>
+              <w:rPr>
+                <w:rFonts w:eastAsia="Aptos"/>
+                <w:kern w:val="2"/>
+                <w:szCs w:val="24"/>
+              </w:rPr>
+              <w:t>review text</w:t>
+            </w:r>
+            <w:proofErr w:type="gramEnd"/>
+            <w:r>
+              <w:rPr>
+                <w:rFonts w:eastAsia="Aptos"/>
+                <w:kern w:val="2"/>
+                <w:szCs w:val="24"/>
+              </w:rPr>
+              <w:t xml:space="preserve"> body.  </w:t>
             </w:r>
           </w:p>
         </w:tc>
@@ -11776,6 +13201,7 @@
                 <w:kern w:val="2"/>
                 <w:szCs w:val="24"/>
               </w:rPr>
+              <w:lastRenderedPageBreak/>
               <w:t>REQ-4.7</w:t>
             </w:r>
           </w:p>
@@ -11893,7 +13319,25 @@
                 <w:kern w:val="2"/>
                 <w:szCs w:val="24"/>
               </w:rPr>
-              <w:t>The system shall provide a "Cancel" button during review editing that discards all unsaved modifications and restores the original review text display.</w:t>
+              <w:t xml:space="preserve">The system </w:t>
+            </w:r>
+            <w:proofErr w:type="gramStart"/>
+            <w:r>
+              <w:rPr>
+                <w:rFonts w:eastAsia="Aptos"/>
+                <w:kern w:val="2"/>
+                <w:szCs w:val="24"/>
+              </w:rPr>
+              <w:t>shall</w:t>
+            </w:r>
+            <w:proofErr w:type="gramEnd"/>
+            <w:r>
+              <w:rPr>
+                <w:rFonts w:eastAsia="Aptos"/>
+                <w:kern w:val="2"/>
+                <w:szCs w:val="24"/>
+              </w:rPr>
+              <w:t xml:space="preserve"> provide a "Cancel" button during review editing that discards all unsaved modifications and restores the original review text display.</w:t>
             </w:r>
           </w:p>
         </w:tc>
@@ -11964,16 +13408,7 @@
                 <w:kern w:val="2"/>
                 <w:szCs w:val="24"/>
               </w:rPr>
-              <w:t xml:space="preserve">The system shall allow authenticated users to delete their own reviews by clicking a "Delete Review" button, requiring confirmation via a confirmation dialog before </w:t>
-            </w:r>
-            <w:r>
-              <w:rPr>
-                <w:rFonts w:eastAsia="Aptos"/>
-                <w:kern w:val="2"/>
-                <w:szCs w:val="24"/>
-              </w:rPr>
-              <w:lastRenderedPageBreak/>
-              <w:t>permanently removing the record from the database.</w:t>
+              <w:t>The system shall allow authenticated users to delete their own reviews by clicking a "Delete Review" button, requiring confirmation via a confirmation dialog before permanently removing the record from the database.</w:t>
             </w:r>
           </w:p>
         </w:tc>
@@ -11998,7 +13433,6 @@
                 <w:kern w:val="2"/>
                 <w:szCs w:val="24"/>
               </w:rPr>
-              <w:lastRenderedPageBreak/>
               <w:t>REQ-4.10</w:t>
             </w:r>
           </w:p>
@@ -12203,7 +13637,7 @@
         <w:pStyle w:val="Heading2"/>
         <w:spacing w:line="276" w:lineRule="auto"/>
       </w:pPr>
-      <w:bookmarkStart w:id="49" w:name="_Toc243827641"/>
+      <w:bookmarkStart w:id="49" w:name="_Toc243844410"/>
       <w:r>
         <w:t>Admin Manual Database Update</w:t>
       </w:r>
@@ -12263,6 +13697,7 @@
         <w:spacing w:line="276" w:lineRule="auto"/>
       </w:pPr>
       <w:r>
+        <w:lastRenderedPageBreak/>
         <w:t>Stimulus/Response Sequences</w:t>
       </w:r>
     </w:p>
@@ -12616,6 +14051,7 @@
           <w:b/>
           <w:bCs/>
         </w:rPr>
+        <w:lastRenderedPageBreak/>
         <w:t>System Response:</w:t>
       </w:r>
       <w:r>
@@ -12681,7 +14117,6 @@
           <w:b/>
           <w:bCs/>
         </w:rPr>
-        <w:lastRenderedPageBreak/>
         <w:t>System Response:</w:t>
       </w:r>
       <w:r>
@@ -13059,7 +14494,16 @@
                 <w:kern w:val="2"/>
                 <w:szCs w:val="24"/>
               </w:rPr>
-              <w:t>The system shall allow administrators to upload a school dataset in CSV format (.csv), previously downloaded by the administrator from external sources such as data.gov.sg. The system shall display the name of the selected file and shall allow the administrator to replace it before starting the update. The system shall not fetch data from external endpoints automatically.</w:t>
+              <w:t xml:space="preserve">The system shall allow administrators to upload a school dataset in CSV format (.csv), previously downloaded by </w:t>
+            </w:r>
+            <w:r>
+              <w:rPr>
+                <w:rFonts w:eastAsia="Aptos"/>
+                <w:kern w:val="2"/>
+                <w:szCs w:val="24"/>
+              </w:rPr>
+              <w:lastRenderedPageBreak/>
+              <w:t>the administrator from external sources such as data.gov.sg. The system shall display the name of the selected file and shall allow the administrator to replace it before starting the update. The system shall not fetch data from external endpoints automatically.</w:t>
             </w:r>
           </w:p>
         </w:tc>
@@ -13084,6 +14528,7 @@
                 <w:kern w:val="2"/>
                 <w:szCs w:val="24"/>
               </w:rPr>
+              <w:lastRenderedPageBreak/>
               <w:t>REQ-5.4</w:t>
             </w:r>
           </w:p>
@@ -13155,7 +14600,6 @@
                 <w:kern w:val="2"/>
                 <w:szCs w:val="24"/>
               </w:rPr>
-              <w:lastRenderedPageBreak/>
               <w:t>REQ-5.5</w:t>
             </w:r>
           </w:p>
@@ -13202,7 +14646,43 @@
                 <w:kern w:val="2"/>
                 <w:szCs w:val="24"/>
               </w:rPr>
-              <w:t>The system shall execute bulk database writes within a single transaction block, ensuring that if any error occurs during parsing, standardizing, or writing, the entire update is rolled back leaving existing records unchanged. New schools shall be added and existing schools (matched by their unique school identifier) shall be updated.</w:t>
+              <w:t xml:space="preserve">The system shall execute bulk database writes within a single transaction block, ensuring that if any error occurs during parsing, standardizing, or writing, the entire update is rolled back leaving existing records unchanged. New schools </w:t>
+            </w:r>
+            <w:proofErr w:type="gramStart"/>
+            <w:r>
+              <w:rPr>
+                <w:rFonts w:eastAsia="Aptos"/>
+                <w:kern w:val="2"/>
+                <w:szCs w:val="24"/>
+              </w:rPr>
+              <w:t>shall</w:t>
+            </w:r>
+            <w:proofErr w:type="gramEnd"/>
+            <w:r>
+              <w:rPr>
+                <w:rFonts w:eastAsia="Aptos"/>
+                <w:kern w:val="2"/>
+                <w:szCs w:val="24"/>
+              </w:rPr>
+              <w:t xml:space="preserve"> be </w:t>
+            </w:r>
+            <w:proofErr w:type="gramStart"/>
+            <w:r>
+              <w:rPr>
+                <w:rFonts w:eastAsia="Aptos"/>
+                <w:kern w:val="2"/>
+                <w:szCs w:val="24"/>
+              </w:rPr>
+              <w:t>added</w:t>
+            </w:r>
+            <w:proofErr w:type="gramEnd"/>
+            <w:r>
+              <w:rPr>
+                <w:rFonts w:eastAsia="Aptos"/>
+                <w:kern w:val="2"/>
+                <w:szCs w:val="24"/>
+              </w:rPr>
+              <w:t xml:space="preserve"> and existing schools (matched by their unique school identifier) shall be updated.</w:t>
             </w:r>
           </w:p>
         </w:tc>
@@ -13511,6 +14991,7 @@
                 <w:kern w:val="2"/>
                 <w:szCs w:val="24"/>
               </w:rPr>
+              <w:lastRenderedPageBreak/>
               <w:t>REQ-5.10</w:t>
             </w:r>
           </w:p>
@@ -13572,9 +15053,11 @@
       <w:pPr>
         <w:pStyle w:val="Heading2"/>
       </w:pPr>
+      <w:bookmarkStart w:id="50" w:name="_Toc243844411"/>
       <w:r>
         <w:t>Admin School Database Export</w:t>
       </w:r>
+      <w:bookmarkEnd w:id="50"/>
     </w:p>
     <w:p>
       <w:pPr>
@@ -13590,7 +15073,6 @@
           <w:b/>
           <w:bCs/>
         </w:rPr>
-        <w:lastRenderedPageBreak/>
         <w:t>Description:</w:t>
       </w:r>
       <w:r>
@@ -13808,6 +15290,7 @@
                 <w:kern w:val="2"/>
                 <w:szCs w:val="24"/>
               </w:rPr>
+              <w:lastRenderedPageBreak/>
               <w:t>Unique ID</w:t>
             </w:r>
           </w:p>
@@ -13925,7 +15408,25 @@
                 <w:kern w:val="2"/>
                 <w:szCs w:val="24"/>
               </w:rPr>
-              <w:t>The system shall provide an "Export Database" button on the Admin Panel, accessible strictly to authenticated administrator accounts.</w:t>
+              <w:t xml:space="preserve">The system </w:t>
+            </w:r>
+            <w:proofErr w:type="gramStart"/>
+            <w:r>
+              <w:rPr>
+                <w:rFonts w:eastAsia="Aptos"/>
+                <w:kern w:val="2"/>
+                <w:szCs w:val="24"/>
+              </w:rPr>
+              <w:t>shall</w:t>
+            </w:r>
+            <w:proofErr w:type="gramEnd"/>
+            <w:r>
+              <w:rPr>
+                <w:rFonts w:eastAsia="Aptos"/>
+                <w:kern w:val="2"/>
+                <w:szCs w:val="24"/>
+              </w:rPr>
+              <w:t xml:space="preserve"> provide an "Export Database" button on the Admin Panel, accessible strictly to authenticated administrator accounts.</w:t>
             </w:r>
           </w:p>
         </w:tc>
@@ -14075,16 +15576,7 @@
                 <w:kern w:val="2"/>
                 <w:szCs w:val="24"/>
               </w:rPr>
-              <w:t xml:space="preserve">The system shall strictly exclude all user account data, saved roadmaps, and community reviews from the school </w:t>
-            </w:r>
-            <w:r>
-              <w:rPr>
-                <w:rFonts w:eastAsia="Aptos"/>
-                <w:kern w:val="2"/>
-                <w:szCs w:val="24"/>
-              </w:rPr>
-              <w:lastRenderedPageBreak/>
-              <w:t>data export.</w:t>
+              <w:t>The system shall strictly exclude all user account data, saved roadmaps, and community reviews from the school data export.</w:t>
             </w:r>
           </w:p>
         </w:tc>
@@ -14109,7 +15601,6 @@
                 <w:kern w:val="2"/>
                 <w:szCs w:val="24"/>
               </w:rPr>
-              <w:lastRenderedPageBreak/>
               <w:t>REQ-5.14</w:t>
             </w:r>
           </w:p>
@@ -14238,21 +15729,21 @@
       <w:pPr>
         <w:pStyle w:val="Heading1"/>
       </w:pPr>
-      <w:bookmarkStart w:id="50" w:name="_Toc243827642"/>
+      <w:bookmarkStart w:id="51" w:name="_Toc243844412"/>
       <w:r>
         <w:t>Other Nonfunctional Requirements</w:t>
       </w:r>
-      <w:bookmarkEnd w:id="50"/>
+      <w:bookmarkEnd w:id="51"/>
     </w:p>
     <w:p>
       <w:pPr>
         <w:pStyle w:val="Heading2"/>
       </w:pPr>
-      <w:bookmarkStart w:id="51" w:name="_Toc243827643"/>
+      <w:bookmarkStart w:id="52" w:name="_Toc243844413"/>
       <w:r>
         <w:t>Performance Requirements</w:t>
       </w:r>
-      <w:bookmarkEnd w:id="51"/>
+      <w:bookmarkEnd w:id="52"/>
     </w:p>
     <w:tbl>
       <w:tblPr>
@@ -14480,7 +15971,25 @@
                 <w:kern w:val="2"/>
                 <w:szCs w:val="24"/>
               </w:rPr>
-              <w:t>The system shall update and render dynamic academic input fields on the user profile within 1 second after a user selects or changes their Target Education Level.</w:t>
+              <w:t xml:space="preserve">The system </w:t>
+            </w:r>
+            <w:proofErr w:type="gramStart"/>
+            <w:r>
+              <w:rPr>
+                <w:rFonts w:eastAsia="Aptos"/>
+                <w:kern w:val="2"/>
+                <w:szCs w:val="24"/>
+              </w:rPr>
+              <w:t>shall</w:t>
+            </w:r>
+            <w:proofErr w:type="gramEnd"/>
+            <w:r>
+              <w:rPr>
+                <w:rFonts w:eastAsia="Aptos"/>
+                <w:kern w:val="2"/>
+                <w:szCs w:val="24"/>
+              </w:rPr>
+              <w:t xml:space="preserve"> update and render dynamic academic input fields on the user profile within 1 second after a user selects or changes their Target Education Level.</w:t>
             </w:r>
           </w:p>
         </w:tc>
@@ -14576,6 +16085,7 @@
                 <w:kern w:val="2"/>
                 <w:szCs w:val="24"/>
               </w:rPr>
+              <w:lastRenderedPageBreak/>
               <w:t>PERF-4</w:t>
             </w:r>
           </w:p>
@@ -14789,7 +16299,6 @@
                 <w:kern w:val="2"/>
                 <w:szCs w:val="24"/>
               </w:rPr>
-              <w:lastRenderedPageBreak/>
               <w:t>PERF-7</w:t>
             </w:r>
           </w:p>
@@ -15033,11 +16542,11 @@
       <w:pPr>
         <w:pStyle w:val="Heading2"/>
       </w:pPr>
-      <w:bookmarkStart w:id="52" w:name="_Toc243827644"/>
+      <w:bookmarkStart w:id="53" w:name="_Toc243844414"/>
       <w:r>
         <w:t>Safety Requirements</w:t>
       </w:r>
-      <w:bookmarkEnd w:id="52"/>
+      <w:bookmarkEnd w:id="53"/>
     </w:p>
     <w:tbl>
       <w:tblPr>
@@ -15224,11 +16733,11 @@
       <w:pPr>
         <w:pStyle w:val="Heading2"/>
       </w:pPr>
-      <w:bookmarkStart w:id="53" w:name="_Toc243827645"/>
+      <w:bookmarkStart w:id="54" w:name="_Toc243844415"/>
       <w:r>
         <w:t>Security Requirements</w:t>
       </w:r>
-      <w:bookmarkEnd w:id="53"/>
+      <w:bookmarkEnd w:id="54"/>
     </w:p>
     <w:tbl>
       <w:tblPr>
@@ -15339,6 +16848,7 @@
                 <w:kern w:val="2"/>
                 <w:szCs w:val="24"/>
               </w:rPr>
+              <w:lastRenderedPageBreak/>
               <w:t>SEC-1</w:t>
             </w:r>
           </w:p>
@@ -15456,7 +16966,25 @@
                 <w:kern w:val="2"/>
                 <w:szCs w:val="24"/>
               </w:rPr>
-              <w:t xml:space="preserve">The system shall enforce password complexity rules requiring a minimum of 8 characters, including at least one numeric digit (0-9) and one special character (e.g., !@#$%^&amp;*).  </w:t>
+              <w:t>The system shall enforce password complexity rules requiring a minimum of 8 characters, including at least one numeric digit (0-9) and one special character (e.g.</w:t>
+            </w:r>
+            <w:proofErr w:type="gramStart"/>
+            <w:r>
+              <w:rPr>
+                <w:rFonts w:eastAsia="Aptos"/>
+                <w:kern w:val="2"/>
+                <w:szCs w:val="24"/>
+              </w:rPr>
+              <w:t>, !</w:t>
+            </w:r>
+            <w:proofErr w:type="gramEnd"/>
+            <w:r>
+              <w:rPr>
+                <w:rFonts w:eastAsia="Aptos"/>
+                <w:kern w:val="2"/>
+                <w:szCs w:val="24"/>
+              </w:rPr>
+              <w:t xml:space="preserve">@#$%^&amp;*).  </w:t>
             </w:r>
           </w:p>
         </w:tc>
@@ -15504,16 +17032,7 @@
                 <w:kern w:val="2"/>
                 <w:szCs w:val="24"/>
               </w:rPr>
-              <w:t xml:space="preserve">Backend Password </w:t>
-            </w:r>
-            <w:r>
-              <w:rPr>
-                <w:rFonts w:eastAsia="Aptos"/>
-                <w:kern w:val="2"/>
-                <w:szCs w:val="24"/>
-              </w:rPr>
-              <w:lastRenderedPageBreak/>
-              <w:t>Hashing</w:t>
+              <w:t>Backend Password Hashing</w:t>
             </w:r>
           </w:p>
         </w:tc>
@@ -15536,17 +17055,43 @@
                 <w:kern w:val="2"/>
                 <w:szCs w:val="24"/>
               </w:rPr>
-              <w:lastRenderedPageBreak/>
-              <w:t xml:space="preserve">The system shall hash user passwords prior to storing in </w:t>
-            </w:r>
-            <w:r>
-              <w:rPr>
-                <w:rFonts w:eastAsia="Aptos"/>
-                <w:kern w:val="2"/>
-                <w:szCs w:val="24"/>
-              </w:rPr>
-              <w:lastRenderedPageBreak/>
-              <w:t xml:space="preserve">the SQLite database.  </w:t>
+              <w:t xml:space="preserve">The system shall </w:t>
+            </w:r>
+            <w:proofErr w:type="gramStart"/>
+            <w:r>
+              <w:rPr>
+                <w:rFonts w:eastAsia="Aptos"/>
+                <w:kern w:val="2"/>
+                <w:szCs w:val="24"/>
+              </w:rPr>
+              <w:t>hash</w:t>
+            </w:r>
+            <w:proofErr w:type="gramEnd"/>
+            <w:r>
+              <w:rPr>
+                <w:rFonts w:eastAsia="Aptos"/>
+                <w:kern w:val="2"/>
+                <w:szCs w:val="24"/>
+              </w:rPr>
+              <w:t xml:space="preserve"> user passwords prior to </w:t>
+            </w:r>
+            <w:proofErr w:type="gramStart"/>
+            <w:r>
+              <w:rPr>
+                <w:rFonts w:eastAsia="Aptos"/>
+                <w:kern w:val="2"/>
+                <w:szCs w:val="24"/>
+              </w:rPr>
+              <w:t>storing</w:t>
+            </w:r>
+            <w:proofErr w:type="gramEnd"/>
+            <w:r>
+              <w:rPr>
+                <w:rFonts w:eastAsia="Aptos"/>
+                <w:kern w:val="2"/>
+                <w:szCs w:val="24"/>
+              </w:rPr>
+              <w:t xml:space="preserve"> in the SQLite database.  </w:t>
             </w:r>
           </w:p>
         </w:tc>
@@ -15571,7 +17116,6 @@
                 <w:kern w:val="2"/>
                 <w:szCs w:val="24"/>
               </w:rPr>
-              <w:lastRenderedPageBreak/>
               <w:t>SEC-4</w:t>
             </w:r>
           </w:p>
@@ -15801,11 +17345,11 @@
       <w:pPr>
         <w:pStyle w:val="Heading2"/>
       </w:pPr>
-      <w:bookmarkStart w:id="54" w:name="_Toc243827646"/>
+      <w:bookmarkStart w:id="55" w:name="_Toc243844416"/>
       <w:r>
         <w:t>Software Quality Attributes</w:t>
       </w:r>
-      <w:bookmarkEnd w:id="54"/>
+      <w:bookmarkEnd w:id="55"/>
     </w:p>
     <w:tbl>
       <w:tblPr>
@@ -16183,6 +17727,7 @@
                 <w:kern w:val="2"/>
                 <w:szCs w:val="24"/>
               </w:rPr>
+              <w:lastRenderedPageBreak/>
               <w:t>QUAL-4</w:t>
             </w:r>
           </w:p>
@@ -16229,7 +17774,25 @@
                 <w:kern w:val="2"/>
                 <w:szCs w:val="24"/>
               </w:rPr>
-              <w:t>The system shall maintain an uptime of at least 95% during the student testing and demonstration period.</w:t>
+              <w:t xml:space="preserve">The system shall maintain an </w:t>
+            </w:r>
+            <w:proofErr w:type="gramStart"/>
+            <w:r>
+              <w:rPr>
+                <w:rFonts w:eastAsia="Aptos"/>
+                <w:kern w:val="2"/>
+                <w:szCs w:val="24"/>
+              </w:rPr>
+              <w:t>uptime</w:t>
+            </w:r>
+            <w:proofErr w:type="gramEnd"/>
+            <w:r>
+              <w:rPr>
+                <w:rFonts w:eastAsia="Aptos"/>
+                <w:kern w:val="2"/>
+                <w:szCs w:val="24"/>
+              </w:rPr>
+              <w:t xml:space="preserve"> of at least 95% during the student testing and demonstration period.</w:t>
             </w:r>
           </w:p>
         </w:tc>
@@ -16396,7 +17959,6 @@
                 <w:kern w:val="2"/>
                 <w:szCs w:val="24"/>
               </w:rPr>
-              <w:lastRenderedPageBreak/>
               <w:t>QUAL -7</w:t>
             </w:r>
           </w:p>
@@ -16458,11 +18020,11 @@
       <w:pPr>
         <w:pStyle w:val="Heading2"/>
       </w:pPr>
-      <w:bookmarkStart w:id="55" w:name="_Toc243827647"/>
+      <w:bookmarkStart w:id="56" w:name="_Toc243844417"/>
       <w:r>
         <w:t>Business Rules</w:t>
       </w:r>
-      <w:bookmarkEnd w:id="55"/>
+      <w:bookmarkEnd w:id="56"/>
     </w:p>
     <w:tbl>
       <w:tblPr>
@@ -16903,7 +18465,16 @@
                 <w:kern w:val="2"/>
                 <w:szCs w:val="24"/>
               </w:rPr>
-              <w:t>Only user accounts granted administrator privileges shall be authorized to upload datasets and execute database update operations.</w:t>
+              <w:t xml:space="preserve">Only user accounts granted administrator privileges shall be authorized to upload datasets and execute database </w:t>
+            </w:r>
+            <w:r>
+              <w:rPr>
+                <w:rFonts w:eastAsia="Aptos"/>
+                <w:kern w:val="2"/>
+                <w:szCs w:val="24"/>
+              </w:rPr>
+              <w:lastRenderedPageBreak/>
+              <w:t>update operations.</w:t>
             </w:r>
           </w:p>
         </w:tc>
@@ -16928,6 +18499,7 @@
                 <w:kern w:val="2"/>
                 <w:szCs w:val="24"/>
               </w:rPr>
+              <w:lastRenderedPageBreak/>
               <w:t>BR-6</w:t>
             </w:r>
           </w:p>
@@ -16989,64 +18561,343 @@
       <w:pPr>
         <w:spacing w:line="276" w:lineRule="auto"/>
       </w:pPr>
+      <w:r>
+        <w:br w:type="page"/>
+      </w:r>
     </w:p>
     <w:p>
       <w:pPr>
         <w:pStyle w:val="Heading1"/>
         <w:spacing w:line="276" w:lineRule="auto"/>
       </w:pPr>
-      <w:bookmarkStart w:id="56" w:name="_Toc439994695"/>
-      <w:bookmarkStart w:id="57" w:name="_Toc243827648"/>
+      <w:bookmarkStart w:id="57" w:name="_Toc439994695"/>
+      <w:bookmarkStart w:id="58" w:name="_Toc243844418"/>
+      <w:r>
+        <w:t>Other Requirements</w:t>
+      </w:r>
+      <w:bookmarkEnd w:id="57"/>
+      <w:bookmarkEnd w:id="58"/>
+    </w:p>
+    <w:p>
+      <w:pPr>
+        <w:pStyle w:val="TOCEntry"/>
+        <w:spacing w:line="276" w:lineRule="auto"/>
+      </w:pPr>
+      <w:bookmarkStart w:id="59" w:name="_Toc439994696"/>
+      <w:bookmarkStart w:id="60" w:name="_Toc243844419"/>
+      <w:r>
+        <w:t xml:space="preserve">Appendix A: </w:t>
+      </w:r>
+      <w:bookmarkEnd w:id="59"/>
+      <w:r>
+        <w:t>Data Dictionary</w:t>
+      </w:r>
+      <w:bookmarkStart w:id="61" w:name="_Toc439994697"/>
+      <w:bookmarkEnd w:id="60"/>
+    </w:p>
+    <w:p>
+      <w:pPr>
+        <w:pStyle w:val="NoSpacing"/>
+      </w:pPr>
+      <w:r>
+        <w:object w:dxaOrig="1522" w:dyaOrig="991" w14:anchorId="59162FB4">
+          <v:shapetype id="_x0000_t75" coordsize="21600,21600" o:spt="75" o:preferrelative="t" path="m@4@5l@4@11@9@11@9@5xe" filled="f" stroked="f">
+            <v:stroke joinstyle="miter"/>
+            <v:formulas>
+              <v:f eqn="if lineDrawn pixelLineWidth 0"/>
+              <v:f eqn="sum @0 1 0"/>
+              <v:f eqn="sum 0 0 @1"/>
+              <v:f eqn="prod @2 1 2"/>
+              <v:f eqn="prod @3 21600 pixelWidth"/>
+              <v:f eqn="prod @3 21600 pixelHeight"/>
+              <v:f eqn="sum @0 0 1"/>
+              <v:f eqn="prod @6 1 2"/>
+              <v:f eqn="prod @7 21600 pixelWidth"/>
+              <v:f eqn="sum @8 21600 0"/>
+              <v:f eqn="prod @7 21600 pixelHeight"/>
+              <v:f eqn="sum @10 21600 0"/>
+            </v:formulas>
+            <v:path o:extrusionok="f" gradientshapeok="t" o:connecttype="rect"/>
+            <o:lock v:ext="edit" aspectratio="t"/>
+          </v:shapetype>
+          <v:shape id="_x0000_i1123" type="#_x0000_t75" style="width:76.2pt;height:49.8pt" o:ole="">
+            <v:imagedata r:id="rId8" o:title=""/>
+          </v:shape>
+          <o:OLEObject Type="Embed" ProgID="Package" ShapeID="_x0000_i1123" DrawAspect="Icon" ObjectID="_1854457220" r:id="rId9"/>
+        </w:object>
+      </w:r>
+    </w:p>
+    <w:p>
+      <w:pPr>
+        <w:pStyle w:val="TOCEntry"/>
+        <w:spacing w:line="276" w:lineRule="auto"/>
+      </w:pPr>
+      <w:bookmarkStart w:id="62" w:name="_Toc243844420"/>
+      <w:r>
+        <w:t>Appendix B: Analysis Models</w:t>
+      </w:r>
+      <w:bookmarkEnd w:id="61"/>
+      <w:bookmarkEnd w:id="62"/>
+    </w:p>
+    <w:p>
+      <w:pPr>
+        <w:pStyle w:val="NoSpacing"/>
+        <w:rPr>
+          <w:sz w:val="32"/>
+          <w:szCs w:val="24"/>
+        </w:rPr>
+      </w:pPr>
+      <w:r>
+        <w:rPr>
+          <w:sz w:val="32"/>
+          <w:szCs w:val="24"/>
+        </w:rPr>
+        <w:t>Appendix B. 1: Class Diagram</w:t>
+      </w:r>
+    </w:p>
+    <w:p>
+      <w:pPr>
+        <w:pStyle w:val="NoSpacing"/>
+        <w:rPr>
+          <w:sz w:val="32"/>
+          <w:szCs w:val="24"/>
+        </w:rPr>
+      </w:pPr>
+      <w:r>
+        <w:rPr>
+          <w:sz w:val="32"/>
+          <w:szCs w:val="24"/>
+        </w:rPr>
+        <w:pict w14:anchorId="68E401E3">
+          <v:shape id="_x0000_i1089" type="#_x0000_t75" style="width:459pt;height:397.2pt">
+            <v:imagedata r:id="rId10" o:title=""/>
+          </v:shape>
+        </w:pict>
+      </w:r>
+    </w:p>
+    <w:p>
+      <w:pPr>
+        <w:pStyle w:val="NoSpacing"/>
+      </w:pPr>
+    </w:p>
+    <w:p>
+      <w:pPr>
+        <w:pStyle w:val="NoSpacing"/>
+      </w:pPr>
+    </w:p>
+    <w:p>
+      <w:pPr>
+        <w:pStyle w:val="NoSpacing"/>
+        <w:rPr>
+          <w:sz w:val="32"/>
+          <w:szCs w:val="24"/>
+        </w:rPr>
+      </w:pPr>
+      <w:r>
+        <w:rPr>
+          <w:sz w:val="32"/>
+          <w:szCs w:val="24"/>
+        </w:rPr>
+        <w:t>Appendix B. 2: Dialog Map</w:t>
+      </w:r>
+    </w:p>
+    <w:p>
+      <w:pPr>
+        <w:pStyle w:val="NoSpacing"/>
+        <w:rPr>
+          <w:sz w:val="32"/>
+          <w:szCs w:val="24"/>
+        </w:rPr>
+      </w:pPr>
+    </w:p>
+    <w:p>
+      <w:pPr>
+        <w:pStyle w:val="NoSpacing"/>
+        <w:rPr>
+          <w:sz w:val="32"/>
+          <w:szCs w:val="24"/>
+        </w:rPr>
+      </w:pPr>
+      <w:r>
+        <w:rPr>
+          <w:sz w:val="32"/>
+          <w:szCs w:val="24"/>
+        </w:rPr>
+        <w:object w:dxaOrig="1522" w:dyaOrig="991" w14:anchorId="601E2927">
+          <v:shape id="_x0000_i1092" type="#_x0000_t75" style="width:76.2pt;height:49.8pt" o:ole="">
+            <v:imagedata r:id="rId11" o:title=""/>
+          </v:shape>
+          <o:OLEObject Type="Embed" ProgID="Package" ShapeID="_x0000_i1092" DrawAspect="Icon" ObjectID="_1854457221" r:id="rId12"/>
+        </w:object>
+      </w:r>
+    </w:p>
+    <w:p>
+      <w:pPr>
+        <w:pStyle w:val="NoSpacing"/>
+        <w:rPr>
+          <w:sz w:val="32"/>
+          <w:szCs w:val="24"/>
+        </w:rPr>
+      </w:pPr>
+      <w:r>
+        <w:rPr>
+          <w:sz w:val="32"/>
+          <w:szCs w:val="24"/>
+        </w:rPr>
+        <w:t>Appendix B. 3: Use Case Diagram</w:t>
+      </w:r>
+    </w:p>
+    <w:p>
+      <w:pPr>
+        <w:pStyle w:val="template"/>
+        <w:spacing w:line="276" w:lineRule="auto"/>
+        <w:rPr>
+          <w:i w:val="0"/>
+        </w:rPr>
+      </w:pPr>
+    </w:p>
+    <w:p>
+      <w:pPr>
+        <w:pStyle w:val="template"/>
+        <w:spacing w:line="276" w:lineRule="auto"/>
+        <w:rPr>
+          <w:i w:val="0"/>
+        </w:rPr>
+      </w:pPr>
+      <w:r>
+        <w:rPr>
+          <w:i w:val="0"/>
+        </w:rPr>
+        <w:pict w14:anchorId="469FFD31">
+          <v:shape id="_x0000_i1093" type="#_x0000_t75" style="width:482.4pt;height:456pt">
+            <v:imagedata r:id="rId13" o:title=""/>
+          </v:shape>
+        </w:pict>
+      </w:r>
+    </w:p>
+    <w:p>
+      <w:pPr>
+        <w:pStyle w:val="template"/>
+        <w:spacing w:line="276" w:lineRule="auto"/>
+        <w:rPr>
+          <w:i w:val="0"/>
+        </w:rPr>
+      </w:pPr>
+    </w:p>
+    <w:p>
+      <w:pPr>
+        <w:pStyle w:val="template"/>
+        <w:spacing w:line="276" w:lineRule="auto"/>
+        <w:rPr>
+          <w:i w:val="0"/>
+        </w:rPr>
+      </w:pPr>
+    </w:p>
+    <w:p>
+      <w:pPr>
+        <w:pStyle w:val="template"/>
+        <w:spacing w:line="276" w:lineRule="auto"/>
+        <w:rPr>
+          <w:i w:val="0"/>
+        </w:rPr>
+      </w:pPr>
+    </w:p>
+    <w:p>
+      <w:pPr>
+        <w:pStyle w:val="TOCEntry"/>
+        <w:spacing w:line="276" w:lineRule="auto"/>
+      </w:pPr>
+      <w:bookmarkStart w:id="63" w:name="_Toc243844421"/>
       <w:r>
         <w:lastRenderedPageBreak/>
-        <w:t>Other Requirements</w:t>
-      </w:r>
-      <w:bookmarkEnd w:id="56"/>
-      <w:bookmarkEnd w:id="57"/>
+        <w:t xml:space="preserve">Appendix </w:t>
+      </w:r>
+      <w:r>
+        <w:t>C</w:t>
+      </w:r>
+      <w:r>
+        <w:t xml:space="preserve">: </w:t>
+      </w:r>
+      <w:r>
+        <w:t>UI Screenshots</w:t>
+      </w:r>
+      <w:bookmarkEnd w:id="63"/>
     </w:p>
     <w:p>
       <w:pPr>
         <w:pStyle w:val="template"/>
         <w:spacing w:line="276" w:lineRule="auto"/>
-      </w:pPr>
-      <w:r>
-        <w:t>&lt;Define any other requirements not covered elsewhere in the SRS. This might include database requirements, internationalization requirements, legal requirements, reuse objectives for the project, and so on. Add any new sections that are pertinent to the project.&gt;</w:t>
-      </w:r>
-    </w:p>
-    <w:p>
-      <w:pPr>
-        <w:pStyle w:val="TOCEntry"/>
-        <w:spacing w:line="276" w:lineRule="auto"/>
-      </w:pPr>
-      <w:bookmarkStart w:id="58" w:name="_Toc439994696"/>
-      <w:bookmarkStart w:id="59" w:name="_Toc243827649"/>
-      <w:r>
-        <w:t>Appendix A: Glossary</w:t>
-      </w:r>
-      <w:bookmarkEnd w:id="58"/>
-      <w:bookmarkEnd w:id="59"/>
+        <w:rPr>
+          <w:i w:val="0"/>
+          <w:noProof/>
+          <w:sz w:val="32"/>
+          <w:szCs w:val="28"/>
+        </w:rPr>
+      </w:pPr>
+      <w:r>
+        <w:rPr>
+          <w:i w:val="0"/>
+          <w:noProof/>
+          <w:sz w:val="32"/>
+          <w:szCs w:val="28"/>
+        </w:rPr>
+        <w:pict w14:anchorId="557E7073">
+          <v:shape id="Picture 1" o:spid="_x0000_i1096" type="#_x0000_t75" style="width:457.8pt;height:134.4pt;visibility:visible;mso-wrap-style:square">
+            <v:imagedata r:id="rId14" o:title=""/>
+          </v:shape>
+        </w:pict>
+      </w:r>
     </w:p>
     <w:p>
       <w:pPr>
         <w:pStyle w:val="template"/>
         <w:spacing w:line="276" w:lineRule="auto"/>
-      </w:pPr>
-      <w:r>
-        <w:t>&lt;Define all the terms necessary to properly interpret the SRS, including acronyms and abbreviations. You may wish to build a separate glossary that spans multiple projects or the entire organization, and just include terms specific to a single project in each SRS.&gt;</w:t>
-      </w:r>
-    </w:p>
-    <w:p>
-      <w:pPr>
-        <w:pStyle w:val="TOCEntry"/>
-        <w:spacing w:line="276" w:lineRule="auto"/>
-      </w:pPr>
-      <w:bookmarkStart w:id="60" w:name="_Toc439994697"/>
-      <w:bookmarkStart w:id="61" w:name="_Toc243827650"/>
-      <w:r>
-        <w:t>Appendix B: Analysis Models</w:t>
-      </w:r>
-      <w:bookmarkEnd w:id="60"/>
-      <w:bookmarkEnd w:id="61"/>
+        <w:rPr>
+          <w:i w:val="0"/>
+          <w:noProof/>
+          <w:sz w:val="32"/>
+          <w:szCs w:val="28"/>
+        </w:rPr>
+      </w:pPr>
+      <w:r>
+        <w:rPr>
+          <w:i w:val="0"/>
+          <w:noProof/>
+          <w:sz w:val="32"/>
+          <w:szCs w:val="28"/>
+        </w:rPr>
+        <w:pict w14:anchorId="46DC186E">
+          <v:shape id="_x0000_i1097" type="#_x0000_t75" style="width:481.8pt;height:267.6pt;visibility:visible;mso-wrap-style:square">
+            <v:imagedata r:id="rId15" o:title=""/>
+          </v:shape>
+        </w:pict>
+      </w:r>
+      <w:r>
+        <w:rPr>
+          <w:i w:val="0"/>
+          <w:noProof/>
+          <w:sz w:val="32"/>
+          <w:szCs w:val="28"/>
+        </w:rPr>
+        <w:pict w14:anchorId="452E4C5C">
+          <v:shape id="_x0000_i1099" type="#_x0000_t75" style="width:482.4pt;height:47.4pt;visibility:visible;mso-wrap-style:square">
+            <v:imagedata r:id="rId16" o:title=""/>
+          </v:shape>
+        </w:pict>
+      </w:r>
+      <w:r>
+        <w:rPr>
+          <w:i w:val="0"/>
+          <w:noProof/>
+          <w:sz w:val="32"/>
+          <w:szCs w:val="28"/>
+        </w:rPr>
+        <w:pict w14:anchorId="6B98699F">
+          <v:shape id="_x0000_i1098" type="#_x0000_t75" style="width:366pt;height:156.6pt;visibility:visible;mso-wrap-style:square">
+            <v:imagedata r:id="rId17" o:title=""/>
+          </v:shape>
+        </w:pict>
+      </w:r>
     </w:p>
     <w:p>
       <w:pPr>
@@ -17054,59 +18905,73 @@
         <w:spacing w:line="276" w:lineRule="auto"/>
         <w:rPr>
           <w:i w:val="0"/>
-        </w:rPr>
-      </w:pPr>
-      <w:r>
-        <w:t>&lt;Optionally, include any pertinent analysis models, such as data flow diagrams, class diagrams, state-transition diagrams, or entity-relationship diagrams</w:t>
-      </w:r>
+          <w:sz w:val="32"/>
+          <w:szCs w:val="28"/>
+        </w:rPr>
+      </w:pPr>
       <w:r>
         <w:rPr>
           <w:i w:val="0"/>
-        </w:rPr>
-        <w:t>.&gt;</w:t>
-      </w:r>
-    </w:p>
-    <w:p>
-      <w:pPr>
-        <w:pStyle w:val="TOCEntry"/>
-        <w:spacing w:line="276" w:lineRule="auto"/>
-      </w:pPr>
-      <w:bookmarkStart w:id="62" w:name="_Toc439994698"/>
-      <w:bookmarkStart w:id="63" w:name="_Toc243827651"/>
-      <w:r>
-        <w:t>Appendix C: To Be Determined List</w:t>
-      </w:r>
-      <w:bookmarkEnd w:id="62"/>
-      <w:bookmarkEnd w:id="63"/>
+          <w:noProof/>
+          <w:sz w:val="32"/>
+          <w:szCs w:val="28"/>
+        </w:rPr>
+        <w:lastRenderedPageBreak/>
+        <w:pict w14:anchorId="7B078B78">
+          <v:shape id="_x0000_i1100" type="#_x0000_t75" style="width:482.4pt;height:406.2pt;visibility:visible;mso-wrap-style:square">
+            <v:imagedata r:id="rId18" o:title=""/>
+          </v:shape>
+        </w:pict>
+      </w:r>
     </w:p>
     <w:p>
       <w:pPr>
         <w:pStyle w:val="template"/>
         <w:spacing w:line="276" w:lineRule="auto"/>
-      </w:pPr>
-      <w:r>
-        <w:t>&lt;Collect a numbered list of the TBD (to be determined) references that remain in the SRS so they can be tracked to closure.&gt;</w:t>
+        <w:rPr>
+          <w:i w:val="0"/>
+          <w:noProof/>
+          <w:sz w:val="32"/>
+          <w:szCs w:val="28"/>
+        </w:rPr>
+      </w:pPr>
+      <w:r>
+        <w:rPr>
+          <w:i w:val="0"/>
+          <w:noProof/>
+          <w:sz w:val="32"/>
+          <w:szCs w:val="28"/>
+        </w:rPr>
+        <w:pict w14:anchorId="5BEC06E4">
+          <v:shape id="_x0000_i1101" type="#_x0000_t75" style="width:463.2pt;height:153pt;visibility:visible;mso-wrap-style:square">
+            <v:imagedata r:id="rId19" o:title=""/>
+          </v:shape>
+        </w:pict>
       </w:r>
     </w:p>
     <w:p>
       <w:pPr>
         <w:pStyle w:val="template"/>
         <w:spacing w:line="276" w:lineRule="auto"/>
-      </w:pPr>
-    </w:p>
-    <w:p>
-      <w:pPr>
-        <w:spacing w:line="276" w:lineRule="auto"/>
-        <w:ind w:left="720"/>
-        <w:rPr>
-          <w:sz w:val="28"/>
-        </w:rPr>
-      </w:pPr>
-      <w:r>
-        <w:rPr>
-          <w:sz w:val="28"/>
-        </w:rPr>
-        <w:t xml:space="preserve">Source: http://www.frontiernet.net/~kwiegers/process_assets/srs_template.doc </w:t>
+        <w:rPr>
+          <w:i w:val="0"/>
+          <w:sz w:val="32"/>
+          <w:szCs w:val="28"/>
+        </w:rPr>
+      </w:pPr>
+      <w:r>
+        <w:rPr>
+          <w:i w:val="0"/>
+          <w:noProof/>
+          <w:sz w:val="32"/>
+          <w:szCs w:val="28"/>
+        </w:rPr>
+        <w:lastRenderedPageBreak/>
+        <w:pict w14:anchorId="0610AA03">
+          <v:shape id="_x0000_i1102" type="#_x0000_t75" style="width:210.6pt;height:456pt;visibility:visible;mso-wrap-style:square">
+            <v:imagedata r:id="rId20" o:title=""/>
+          </v:shape>
+        </w:pict>
       </w:r>
     </w:p>
     <w:p>
@@ -17116,7 +18981,7 @@
       </w:pPr>
     </w:p>
     <w:sectPr>
-      <w:headerReference w:type="default" r:id="rId8"/>
+      <w:headerReference w:type="default" r:id="rId21"/>
       <w:pgSz w:w="12240" w:h="15840" w:code="1"/>
       <w:pgMar w:top="1440" w:right="1296" w:bottom="1440" w:left="1296" w:header="720" w:footer="720" w:gutter="0"/>
       <w:pgNumType w:start="1"/>
@@ -19445,6 +21310,232 @@
     </w:lvl>
   </w:abstractNum>
   <w:abstractNum w:abstractNumId="20" w15:restartNumberingAfterBreak="0">
+    <w:nsid w:val="2D38066D"/>
+    <w:multiLevelType w:val="hybridMultilevel"/>
+    <w:tmpl w:val="4CBEA250"/>
+    <w:lvl w:ilvl="0" w:tplc="04090001">
+      <w:start w:val="1"/>
+      <w:numFmt w:val="bullet"/>
+      <w:lvlText w:val=""/>
+      <w:lvlJc w:val="left"/>
+      <w:pPr>
+        <w:ind w:left="720" w:hanging="360"/>
+      </w:pPr>
+      <w:rPr>
+        <w:rFonts w:ascii="Symbol" w:hAnsi="Symbol" w:hint="default"/>
+      </w:rPr>
+    </w:lvl>
+    <w:lvl w:ilvl="1" w:tplc="04090003" w:tentative="1">
+      <w:start w:val="1"/>
+      <w:numFmt w:val="bullet"/>
+      <w:lvlText w:val="o"/>
+      <w:lvlJc w:val="left"/>
+      <w:pPr>
+        <w:ind w:left="1440" w:hanging="360"/>
+      </w:pPr>
+      <w:rPr>
+        <w:rFonts w:ascii="Courier New" w:hAnsi="Courier New" w:cs="Courier New" w:hint="default"/>
+      </w:rPr>
+    </w:lvl>
+    <w:lvl w:ilvl="2" w:tplc="04090005" w:tentative="1">
+      <w:start w:val="1"/>
+      <w:numFmt w:val="bullet"/>
+      <w:lvlText w:val=""/>
+      <w:lvlJc w:val="left"/>
+      <w:pPr>
+        <w:ind w:left="2160" w:hanging="360"/>
+      </w:pPr>
+      <w:rPr>
+        <w:rFonts w:ascii="Wingdings" w:hAnsi="Wingdings" w:hint="default"/>
+      </w:rPr>
+    </w:lvl>
+    <w:lvl w:ilvl="3" w:tplc="04090001" w:tentative="1">
+      <w:start w:val="1"/>
+      <w:numFmt w:val="bullet"/>
+      <w:lvlText w:val=""/>
+      <w:lvlJc w:val="left"/>
+      <w:pPr>
+        <w:ind w:left="2880" w:hanging="360"/>
+      </w:pPr>
+      <w:rPr>
+        <w:rFonts w:ascii="Symbol" w:hAnsi="Symbol" w:hint="default"/>
+      </w:rPr>
+    </w:lvl>
+    <w:lvl w:ilvl="4" w:tplc="04090003" w:tentative="1">
+      <w:start w:val="1"/>
+      <w:numFmt w:val="bullet"/>
+      <w:lvlText w:val="o"/>
+      <w:lvlJc w:val="left"/>
+      <w:pPr>
+        <w:ind w:left="3600" w:hanging="360"/>
+      </w:pPr>
+      <w:rPr>
+        <w:rFonts w:ascii="Courier New" w:hAnsi="Courier New" w:cs="Courier New" w:hint="default"/>
+      </w:rPr>
+    </w:lvl>
+    <w:lvl w:ilvl="5" w:tplc="04090005" w:tentative="1">
+      <w:start w:val="1"/>
+      <w:numFmt w:val="bullet"/>
+      <w:lvlText w:val=""/>
+      <w:lvlJc w:val="left"/>
+      <w:pPr>
+        <w:ind w:left="4320" w:hanging="360"/>
+      </w:pPr>
+      <w:rPr>
+        <w:rFonts w:ascii="Wingdings" w:hAnsi="Wingdings" w:hint="default"/>
+      </w:rPr>
+    </w:lvl>
+    <w:lvl w:ilvl="6" w:tplc="04090001" w:tentative="1">
+      <w:start w:val="1"/>
+      <w:numFmt w:val="bullet"/>
+      <w:lvlText w:val=""/>
+      <w:lvlJc w:val="left"/>
+      <w:pPr>
+        <w:ind w:left="5040" w:hanging="360"/>
+      </w:pPr>
+      <w:rPr>
+        <w:rFonts w:ascii="Symbol" w:hAnsi="Symbol" w:hint="default"/>
+      </w:rPr>
+    </w:lvl>
+    <w:lvl w:ilvl="7" w:tplc="04090003" w:tentative="1">
+      <w:start w:val="1"/>
+      <w:numFmt w:val="bullet"/>
+      <w:lvlText w:val="o"/>
+      <w:lvlJc w:val="left"/>
+      <w:pPr>
+        <w:ind w:left="5760" w:hanging="360"/>
+      </w:pPr>
+      <w:rPr>
+        <w:rFonts w:ascii="Courier New" w:hAnsi="Courier New" w:cs="Courier New" w:hint="default"/>
+      </w:rPr>
+    </w:lvl>
+    <w:lvl w:ilvl="8" w:tplc="04090005" w:tentative="1">
+      <w:start w:val="1"/>
+      <w:numFmt w:val="bullet"/>
+      <w:lvlText w:val=""/>
+      <w:lvlJc w:val="left"/>
+      <w:pPr>
+        <w:ind w:left="6480" w:hanging="360"/>
+      </w:pPr>
+      <w:rPr>
+        <w:rFonts w:ascii="Wingdings" w:hAnsi="Wingdings" w:hint="default"/>
+      </w:rPr>
+    </w:lvl>
+  </w:abstractNum>
+  <w:abstractNum w:abstractNumId="21" w15:restartNumberingAfterBreak="0">
+    <w:nsid w:val="2E8D0B1B"/>
+    <w:multiLevelType w:val="hybridMultilevel"/>
+    <w:tmpl w:val="8146FA74"/>
+    <w:lvl w:ilvl="0" w:tplc="04090001">
+      <w:start w:val="1"/>
+      <w:numFmt w:val="bullet"/>
+      <w:lvlText w:val=""/>
+      <w:lvlJc w:val="left"/>
+      <w:pPr>
+        <w:ind w:left="720" w:hanging="360"/>
+      </w:pPr>
+      <w:rPr>
+        <w:rFonts w:ascii="Symbol" w:hAnsi="Symbol" w:hint="default"/>
+      </w:rPr>
+    </w:lvl>
+    <w:lvl w:ilvl="1" w:tplc="04090003" w:tentative="1">
+      <w:start w:val="1"/>
+      <w:numFmt w:val="bullet"/>
+      <w:lvlText w:val="o"/>
+      <w:lvlJc w:val="left"/>
+      <w:pPr>
+        <w:ind w:left="1440" w:hanging="360"/>
+      </w:pPr>
+      <w:rPr>
+        <w:rFonts w:ascii="Courier New" w:hAnsi="Courier New" w:cs="Courier New" w:hint="default"/>
+      </w:rPr>
+    </w:lvl>
+    <w:lvl w:ilvl="2" w:tplc="04090005" w:tentative="1">
+      <w:start w:val="1"/>
+      <w:numFmt w:val="bullet"/>
+      <w:lvlText w:val=""/>
+      <w:lvlJc w:val="left"/>
+      <w:pPr>
+        <w:ind w:left="2160" w:hanging="360"/>
+      </w:pPr>
+      <w:rPr>
+        <w:rFonts w:ascii="Wingdings" w:hAnsi="Wingdings" w:hint="default"/>
+      </w:rPr>
+    </w:lvl>
+    <w:lvl w:ilvl="3" w:tplc="04090001" w:tentative="1">
+      <w:start w:val="1"/>
+      <w:numFmt w:val="bullet"/>
+      <w:lvlText w:val=""/>
+      <w:lvlJc w:val="left"/>
+      <w:pPr>
+        <w:ind w:left="2880" w:hanging="360"/>
+      </w:pPr>
+      <w:rPr>
+        <w:rFonts w:ascii="Symbol" w:hAnsi="Symbol" w:hint="default"/>
+      </w:rPr>
+    </w:lvl>
+    <w:lvl w:ilvl="4" w:tplc="04090003" w:tentative="1">
+      <w:start w:val="1"/>
+      <w:numFmt w:val="bullet"/>
+      <w:lvlText w:val="o"/>
+      <w:lvlJc w:val="left"/>
+      <w:pPr>
+        <w:ind w:left="3600" w:hanging="360"/>
+      </w:pPr>
+      <w:rPr>
+        <w:rFonts w:ascii="Courier New" w:hAnsi="Courier New" w:cs="Courier New" w:hint="default"/>
+      </w:rPr>
+    </w:lvl>
+    <w:lvl w:ilvl="5" w:tplc="04090005" w:tentative="1">
+      <w:start w:val="1"/>
+      <w:numFmt w:val="bullet"/>
+      <w:lvlText w:val=""/>
+      <w:lvlJc w:val="left"/>
+      <w:pPr>
+        <w:ind w:left="4320" w:hanging="360"/>
+      </w:pPr>
+      <w:rPr>
+        <w:rFonts w:ascii="Wingdings" w:hAnsi="Wingdings" w:hint="default"/>
+      </w:rPr>
+    </w:lvl>
+    <w:lvl w:ilvl="6" w:tplc="04090001" w:tentative="1">
+      <w:start w:val="1"/>
+      <w:numFmt w:val="bullet"/>
+      <w:lvlText w:val=""/>
+      <w:lvlJc w:val="left"/>
+      <w:pPr>
+        <w:ind w:left="5040" w:hanging="360"/>
+      </w:pPr>
+      <w:rPr>
+        <w:rFonts w:ascii="Symbol" w:hAnsi="Symbol" w:hint="default"/>
+      </w:rPr>
+    </w:lvl>
+    <w:lvl w:ilvl="7" w:tplc="04090003" w:tentative="1">
+      <w:start w:val="1"/>
+      <w:numFmt w:val="bullet"/>
+      <w:lvlText w:val="o"/>
+      <w:lvlJc w:val="left"/>
+      <w:pPr>
+        <w:ind w:left="5760" w:hanging="360"/>
+      </w:pPr>
+      <w:rPr>
+        <w:rFonts w:ascii="Courier New" w:hAnsi="Courier New" w:cs="Courier New" w:hint="default"/>
+      </w:rPr>
+    </w:lvl>
+    <w:lvl w:ilvl="8" w:tplc="04090005" w:tentative="1">
+      <w:start w:val="1"/>
+      <w:numFmt w:val="bullet"/>
+      <w:lvlText w:val=""/>
+      <w:lvlJc w:val="left"/>
+      <w:pPr>
+        <w:ind w:left="6480" w:hanging="360"/>
+      </w:pPr>
+      <w:rPr>
+        <w:rFonts w:ascii="Wingdings" w:hAnsi="Wingdings" w:hint="default"/>
+      </w:rPr>
+    </w:lvl>
+  </w:abstractNum>
+  <w:abstractNum w:abstractNumId="22" w15:restartNumberingAfterBreak="0">
     <w:nsid w:val="35467B67"/>
     <w:multiLevelType w:val="hybridMultilevel"/>
     <w:tmpl w:val="DE24B6C6"/>
@@ -19557,7 +21648,7 @@
       </w:rPr>
     </w:lvl>
   </w:abstractNum>
-  <w:abstractNum w:abstractNumId="21" w15:restartNumberingAfterBreak="0">
+  <w:abstractNum w:abstractNumId="23" w15:restartNumberingAfterBreak="0">
     <w:nsid w:val="39496E60"/>
     <w:multiLevelType w:val="hybridMultilevel"/>
     <w:tmpl w:val="58A05C62"/>
@@ -19670,7 +21761,7 @@
       </w:rPr>
     </w:lvl>
   </w:abstractNum>
-  <w:abstractNum w:abstractNumId="22" w15:restartNumberingAfterBreak="0">
+  <w:abstractNum w:abstractNumId="24" w15:restartNumberingAfterBreak="0">
     <w:nsid w:val="3B404514"/>
     <w:multiLevelType w:val="hybridMultilevel"/>
     <w:tmpl w:val="BF9C6BB6"/>
@@ -19783,7 +21874,7 @@
       </w:rPr>
     </w:lvl>
   </w:abstractNum>
-  <w:abstractNum w:abstractNumId="23" w15:restartNumberingAfterBreak="0">
+  <w:abstractNum w:abstractNumId="25" w15:restartNumberingAfterBreak="0">
     <w:nsid w:val="3F48761F"/>
     <w:multiLevelType w:val="hybridMultilevel"/>
     <w:tmpl w:val="CC464EAE"/>
@@ -19896,7 +21987,7 @@
       </w:rPr>
     </w:lvl>
   </w:abstractNum>
-  <w:abstractNum w:abstractNumId="24" w15:restartNumberingAfterBreak="0">
+  <w:abstractNum w:abstractNumId="26" w15:restartNumberingAfterBreak="0">
     <w:nsid w:val="40BB1218"/>
     <w:multiLevelType w:val="hybridMultilevel"/>
     <w:tmpl w:val="8BFE278A"/>
@@ -20009,7 +22100,7 @@
       </w:rPr>
     </w:lvl>
   </w:abstractNum>
-  <w:abstractNum w:abstractNumId="25" w15:restartNumberingAfterBreak="0">
+  <w:abstractNum w:abstractNumId="27" w15:restartNumberingAfterBreak="0">
     <w:nsid w:val="4C755E91"/>
     <w:multiLevelType w:val="hybridMultilevel"/>
     <w:tmpl w:val="38404076"/>
@@ -20122,7 +22213,7 @@
       </w:rPr>
     </w:lvl>
   </w:abstractNum>
-  <w:abstractNum w:abstractNumId="26" w15:restartNumberingAfterBreak="0">
+  <w:abstractNum w:abstractNumId="28" w15:restartNumberingAfterBreak="0">
     <w:nsid w:val="51B00992"/>
     <w:multiLevelType w:val="hybridMultilevel"/>
     <w:tmpl w:val="B79C4D8C"/>
@@ -20235,7 +22326,7 @@
       </w:rPr>
     </w:lvl>
   </w:abstractNum>
-  <w:abstractNum w:abstractNumId="27" w15:restartNumberingAfterBreak="0">
+  <w:abstractNum w:abstractNumId="29" w15:restartNumberingAfterBreak="0">
     <w:nsid w:val="5397137D"/>
     <w:multiLevelType w:val="hybridMultilevel"/>
     <w:tmpl w:val="9046545E"/>
@@ -20348,7 +22439,7 @@
       </w:rPr>
     </w:lvl>
   </w:abstractNum>
-  <w:abstractNum w:abstractNumId="28" w15:restartNumberingAfterBreak="0">
+  <w:abstractNum w:abstractNumId="30" w15:restartNumberingAfterBreak="0">
     <w:nsid w:val="573E35EB"/>
     <w:multiLevelType w:val="hybridMultilevel"/>
     <w:tmpl w:val="54D03346"/>
@@ -20461,7 +22552,7 @@
       </w:rPr>
     </w:lvl>
   </w:abstractNum>
-  <w:abstractNum w:abstractNumId="29" w15:restartNumberingAfterBreak="0">
+  <w:abstractNum w:abstractNumId="31" w15:restartNumberingAfterBreak="0">
     <w:nsid w:val="57BC7DB5"/>
     <w:multiLevelType w:val="hybridMultilevel"/>
     <w:tmpl w:val="CF488E84"/>
@@ -20574,7 +22665,7 @@
       </w:rPr>
     </w:lvl>
   </w:abstractNum>
-  <w:abstractNum w:abstractNumId="30" w15:restartNumberingAfterBreak="0">
+  <w:abstractNum w:abstractNumId="32" w15:restartNumberingAfterBreak="0">
     <w:nsid w:val="58697DBD"/>
     <w:multiLevelType w:val="hybridMultilevel"/>
     <w:tmpl w:val="FFDC5920"/>
@@ -20687,7 +22778,7 @@
       </w:rPr>
     </w:lvl>
   </w:abstractNum>
-  <w:abstractNum w:abstractNumId="31" w15:restartNumberingAfterBreak="0">
+  <w:abstractNum w:abstractNumId="33" w15:restartNumberingAfterBreak="0">
     <w:nsid w:val="592D6591"/>
     <w:multiLevelType w:val="hybridMultilevel"/>
     <w:tmpl w:val="EE40C15E"/>
@@ -20776,7 +22867,7 @@
       </w:pPr>
     </w:lvl>
   </w:abstractNum>
-  <w:abstractNum w:abstractNumId="32" w15:restartNumberingAfterBreak="0">
+  <w:abstractNum w:abstractNumId="34" w15:restartNumberingAfterBreak="0">
     <w:nsid w:val="5DEF5278"/>
     <w:multiLevelType w:val="hybridMultilevel"/>
     <w:tmpl w:val="FF44960A"/>
@@ -20889,7 +22980,7 @@
       </w:rPr>
     </w:lvl>
   </w:abstractNum>
-  <w:abstractNum w:abstractNumId="33" w15:restartNumberingAfterBreak="0">
+  <w:abstractNum w:abstractNumId="35" w15:restartNumberingAfterBreak="0">
     <w:nsid w:val="5E873680"/>
     <w:multiLevelType w:val="hybridMultilevel"/>
     <w:tmpl w:val="0DC80DCC"/>
@@ -21002,7 +23093,7 @@
       </w:rPr>
     </w:lvl>
   </w:abstractNum>
-  <w:abstractNum w:abstractNumId="34" w15:restartNumberingAfterBreak="0">
+  <w:abstractNum w:abstractNumId="36" w15:restartNumberingAfterBreak="0">
     <w:nsid w:val="62D001F8"/>
     <w:multiLevelType w:val="hybridMultilevel"/>
     <w:tmpl w:val="8164762C"/>
@@ -21115,7 +23206,7 @@
       </w:rPr>
     </w:lvl>
   </w:abstractNum>
-  <w:abstractNum w:abstractNumId="35" w15:restartNumberingAfterBreak="0">
+  <w:abstractNum w:abstractNumId="37" w15:restartNumberingAfterBreak="0">
     <w:nsid w:val="65497305"/>
     <w:multiLevelType w:val="hybridMultilevel"/>
     <w:tmpl w:val="B1582F9C"/>
@@ -21228,7 +23319,7 @@
       </w:rPr>
     </w:lvl>
   </w:abstractNum>
-  <w:abstractNum w:abstractNumId="36" w15:restartNumberingAfterBreak="0">
+  <w:abstractNum w:abstractNumId="38" w15:restartNumberingAfterBreak="0">
     <w:nsid w:val="66267C18"/>
     <w:multiLevelType w:val="hybridMultilevel"/>
     <w:tmpl w:val="E10C0670"/>
@@ -21341,7 +23432,7 @@
       </w:rPr>
     </w:lvl>
   </w:abstractNum>
-  <w:abstractNum w:abstractNumId="37" w15:restartNumberingAfterBreak="0">
+  <w:abstractNum w:abstractNumId="39" w15:restartNumberingAfterBreak="0">
     <w:nsid w:val="673C435F"/>
     <w:multiLevelType w:val="hybridMultilevel"/>
     <w:tmpl w:val="95E29146"/>
@@ -21454,7 +23545,7 @@
       </w:rPr>
     </w:lvl>
   </w:abstractNum>
-  <w:abstractNum w:abstractNumId="38" w15:restartNumberingAfterBreak="0">
+  <w:abstractNum w:abstractNumId="40" w15:restartNumberingAfterBreak="0">
     <w:nsid w:val="6C47320A"/>
     <w:multiLevelType w:val="hybridMultilevel"/>
     <w:tmpl w:val="EB9A063C"/>
@@ -21567,7 +23658,7 @@
       </w:rPr>
     </w:lvl>
   </w:abstractNum>
-  <w:abstractNum w:abstractNumId="39" w15:restartNumberingAfterBreak="0">
+  <w:abstractNum w:abstractNumId="41" w15:restartNumberingAfterBreak="0">
     <w:nsid w:val="6FA430A2"/>
     <w:multiLevelType w:val="hybridMultilevel"/>
     <w:tmpl w:val="E99A8024"/>
@@ -21680,7 +23771,7 @@
       </w:rPr>
     </w:lvl>
   </w:abstractNum>
-  <w:abstractNum w:abstractNumId="40" w15:restartNumberingAfterBreak="0">
+  <w:abstractNum w:abstractNumId="42" w15:restartNumberingAfterBreak="0">
     <w:nsid w:val="713D08B9"/>
     <w:multiLevelType w:val="hybridMultilevel"/>
     <w:tmpl w:val="C4F2F124"/>
@@ -21793,7 +23884,7 @@
       </w:rPr>
     </w:lvl>
   </w:abstractNum>
-  <w:abstractNum w:abstractNumId="41" w15:restartNumberingAfterBreak="0">
+  <w:abstractNum w:abstractNumId="43" w15:restartNumberingAfterBreak="0">
     <w:nsid w:val="78330887"/>
     <w:multiLevelType w:val="hybridMultilevel"/>
     <w:tmpl w:val="98BC135E"/>
@@ -21906,7 +23997,7 @@
       </w:rPr>
     </w:lvl>
   </w:abstractNum>
-  <w:abstractNum w:abstractNumId="42" w15:restartNumberingAfterBreak="0">
+  <w:abstractNum w:abstractNumId="44" w15:restartNumberingAfterBreak="0">
     <w:nsid w:val="79E64025"/>
     <w:multiLevelType w:val="hybridMultilevel"/>
     <w:tmpl w:val="04C45072"/>
@@ -22019,7 +24110,7 @@
       </w:rPr>
     </w:lvl>
   </w:abstractNum>
-  <w:abstractNum w:abstractNumId="43" w15:restartNumberingAfterBreak="0">
+  <w:abstractNum w:abstractNumId="45" w15:restartNumberingAfterBreak="0">
     <w:nsid w:val="7AB12427"/>
     <w:multiLevelType w:val="hybridMultilevel"/>
     <w:tmpl w:val="2DCC3816"/>
@@ -22132,7 +24223,7 @@
       </w:rPr>
     </w:lvl>
   </w:abstractNum>
-  <w:abstractNum w:abstractNumId="44" w15:restartNumberingAfterBreak="0">
+  <w:abstractNum w:abstractNumId="46" w15:restartNumberingAfterBreak="0">
     <w:nsid w:val="7CDC5ABF"/>
     <w:multiLevelType w:val="hybridMultilevel"/>
     <w:tmpl w:val="3B861426"/>
@@ -22245,7 +24336,7 @@
       </w:rPr>
     </w:lvl>
   </w:abstractNum>
-  <w:abstractNum w:abstractNumId="45" w15:restartNumberingAfterBreak="0">
+  <w:abstractNum w:abstractNumId="47" w15:restartNumberingAfterBreak="0">
     <w:nsid w:val="7D8350E2"/>
     <w:multiLevelType w:val="hybridMultilevel"/>
     <w:tmpl w:val="6FDA6380"/>
@@ -22358,7 +24449,7 @@
       </w:rPr>
     </w:lvl>
   </w:abstractNum>
-  <w:abstractNum w:abstractNumId="46" w15:restartNumberingAfterBreak="0">
+  <w:abstractNum w:abstractNumId="48" w15:restartNumberingAfterBreak="0">
     <w:nsid w:val="7DA97F14"/>
     <w:multiLevelType w:val="hybridMultilevel"/>
     <w:tmpl w:val="099ABB10"/>
@@ -22471,7 +24562,7 @@
       </w:rPr>
     </w:lvl>
   </w:abstractNum>
-  <w:abstractNum w:abstractNumId="47" w15:restartNumberingAfterBreak="0">
+  <w:abstractNum w:abstractNumId="49" w15:restartNumberingAfterBreak="0">
     <w:nsid w:val="7E711BF3"/>
     <w:multiLevelType w:val="hybridMultilevel"/>
     <w:tmpl w:val="C8AAB722"/>
@@ -22588,10 +24679,10 @@
     <w:abstractNumId w:val="0"/>
   </w:num>
   <w:num w:numId="2" w16cid:durableId="1222328997">
-    <w:abstractNumId w:val="46"/>
+    <w:abstractNumId w:val="48"/>
   </w:num>
   <w:num w:numId="3" w16cid:durableId="1463770874">
-    <w:abstractNumId w:val="32"/>
+    <w:abstractNumId w:val="34"/>
   </w:num>
   <w:num w:numId="4" w16cid:durableId="1519347922">
     <w:abstractNumId w:val="2"/>
@@ -22600,55 +24691,55 @@
     <w:abstractNumId w:val="5"/>
   </w:num>
   <w:num w:numId="6" w16cid:durableId="1748452673">
+    <w:abstractNumId w:val="33"/>
+  </w:num>
+  <w:num w:numId="7" w16cid:durableId="196705357">
     <w:abstractNumId w:val="31"/>
   </w:num>
-  <w:num w:numId="7" w16cid:durableId="196705357">
-    <w:abstractNumId w:val="29"/>
-  </w:num>
   <w:num w:numId="8" w16cid:durableId="2125532583">
-    <w:abstractNumId w:val="38"/>
+    <w:abstractNumId w:val="40"/>
   </w:num>
   <w:num w:numId="9" w16cid:durableId="653027640">
-    <w:abstractNumId w:val="35"/>
+    <w:abstractNumId w:val="37"/>
   </w:num>
   <w:num w:numId="10" w16cid:durableId="753556007">
-    <w:abstractNumId w:val="25"/>
+    <w:abstractNumId w:val="27"/>
   </w:num>
   <w:num w:numId="11" w16cid:durableId="930939362">
-    <w:abstractNumId w:val="44"/>
+    <w:abstractNumId w:val="46"/>
   </w:num>
   <w:num w:numId="12" w16cid:durableId="1218278246">
-    <w:abstractNumId w:val="26"/>
+    <w:abstractNumId w:val="28"/>
   </w:num>
   <w:num w:numId="13" w16cid:durableId="353699483">
     <w:abstractNumId w:val="17"/>
   </w:num>
   <w:num w:numId="14" w16cid:durableId="1329869488">
-    <w:abstractNumId w:val="23"/>
+    <w:abstractNumId w:val="25"/>
   </w:num>
   <w:num w:numId="15" w16cid:durableId="1907300152">
-    <w:abstractNumId w:val="45"/>
+    <w:abstractNumId w:val="47"/>
   </w:num>
   <w:num w:numId="16" w16cid:durableId="1265726144">
-    <w:abstractNumId w:val="47"/>
+    <w:abstractNumId w:val="49"/>
   </w:num>
   <w:num w:numId="17" w16cid:durableId="1068571539">
     <w:abstractNumId w:val="3"/>
   </w:num>
   <w:num w:numId="18" w16cid:durableId="1091119529">
-    <w:abstractNumId w:val="34"/>
+    <w:abstractNumId w:val="36"/>
   </w:num>
   <w:num w:numId="19" w16cid:durableId="1163083350">
     <w:abstractNumId w:val="13"/>
   </w:num>
   <w:num w:numId="20" w16cid:durableId="2051032133">
-    <w:abstractNumId w:val="22"/>
+    <w:abstractNumId w:val="24"/>
   </w:num>
   <w:num w:numId="21" w16cid:durableId="1045134179">
-    <w:abstractNumId w:val="30"/>
+    <w:abstractNumId w:val="32"/>
   </w:num>
   <w:num w:numId="22" w16cid:durableId="669598469">
-    <w:abstractNumId w:val="36"/>
+    <w:abstractNumId w:val="38"/>
   </w:num>
   <w:num w:numId="23" w16cid:durableId="426773495">
     <w:abstractNumId w:val="16"/>
@@ -22657,31 +24748,31 @@
     <w:abstractNumId w:val="10"/>
   </w:num>
   <w:num w:numId="25" w16cid:durableId="2098595924">
-    <w:abstractNumId w:val="21"/>
+    <w:abstractNumId w:val="23"/>
   </w:num>
   <w:num w:numId="26" w16cid:durableId="689569801">
-    <w:abstractNumId w:val="41"/>
+    <w:abstractNumId w:val="43"/>
   </w:num>
   <w:num w:numId="27" w16cid:durableId="229927617">
-    <w:abstractNumId w:val="20"/>
+    <w:abstractNumId w:val="22"/>
   </w:num>
   <w:num w:numId="28" w16cid:durableId="1515151342">
     <w:abstractNumId w:val="1"/>
   </w:num>
   <w:num w:numId="29" w16cid:durableId="922492521">
-    <w:abstractNumId w:val="33"/>
+    <w:abstractNumId w:val="35"/>
   </w:num>
   <w:num w:numId="30" w16cid:durableId="1296763558">
     <w:abstractNumId w:val="18"/>
   </w:num>
   <w:num w:numId="31" w16cid:durableId="116418699">
-    <w:abstractNumId w:val="43"/>
+    <w:abstractNumId w:val="45"/>
   </w:num>
   <w:num w:numId="32" w16cid:durableId="274289019">
     <w:abstractNumId w:val="15"/>
   </w:num>
   <w:num w:numId="33" w16cid:durableId="50538234">
-    <w:abstractNumId w:val="42"/>
+    <w:abstractNumId w:val="44"/>
   </w:num>
   <w:num w:numId="34" w16cid:durableId="114376521">
     <w:abstractNumId w:val="4"/>
@@ -22690,13 +24781,13 @@
     <w:abstractNumId w:val="19"/>
   </w:num>
   <w:num w:numId="36" w16cid:durableId="1521816235">
-    <w:abstractNumId w:val="27"/>
+    <w:abstractNumId w:val="29"/>
   </w:num>
   <w:num w:numId="37" w16cid:durableId="2076390803">
     <w:abstractNumId w:val="9"/>
   </w:num>
   <w:num w:numId="38" w16cid:durableId="637688670">
-    <w:abstractNumId w:val="39"/>
+    <w:abstractNumId w:val="41"/>
   </w:num>
   <w:num w:numId="39" w16cid:durableId="727604841">
     <w:abstractNumId w:val="11"/>
@@ -22711,22 +24802,28 @@
     <w:abstractNumId w:val="8"/>
   </w:num>
   <w:num w:numId="43" w16cid:durableId="1828279290">
-    <w:abstractNumId w:val="28"/>
+    <w:abstractNumId w:val="30"/>
   </w:num>
   <w:num w:numId="44" w16cid:durableId="909661098">
-    <w:abstractNumId w:val="37"/>
+    <w:abstractNumId w:val="39"/>
   </w:num>
   <w:num w:numId="45" w16cid:durableId="1511530936">
-    <w:abstractNumId w:val="24"/>
+    <w:abstractNumId w:val="26"/>
   </w:num>
   <w:num w:numId="46" w16cid:durableId="758211189">
-    <w:abstractNumId w:val="40"/>
+    <w:abstractNumId w:val="42"/>
   </w:num>
   <w:num w:numId="47" w16cid:durableId="932281496">
     <w:abstractNumId w:val="12"/>
   </w:num>
   <w:num w:numId="48" w16cid:durableId="31420904">
     <w:abstractNumId w:val="6"/>
+  </w:num>
+  <w:num w:numId="49" w16cid:durableId="79718801">
+    <w:abstractNumId w:val="20"/>
+  </w:num>
+  <w:num w:numId="50" w16cid:durableId="1710841299">
+    <w:abstractNumId w:val="21"/>
   </w:num>
 </w:numbering>
 </file>
@@ -24056,6 +26153,17 @@
       <w:shd w:val="clear" w:color="auto" w:fill="E1DFDD"/>
     </w:rPr>
   </w:style>
+  <w:style w:type="paragraph" w:styleId="NoSpacing">
+    <w:name w:val="No Spacing"/>
+    <w:uiPriority w:val="1"/>
+    <w:qFormat/>
+    <w:rsid w:val="00793903"/>
+    <w:rPr>
+      <w:rFonts w:ascii="Times" w:hAnsi="Times"/>
+      <w:sz w:val="24"/>
+      <w:lang w:eastAsia="en-SG"/>
+    </w:rPr>
+  </w:style>
 </w:styles>
 </file>
 

</xml_diff>